<commit_message>
Add modular optional sections, dynamic TOC/numbering, and scope-by-rotation
Co-Authored-By: Claude Opus 4.8 <noreply@anthropic.com>
</commit_message>
<xml_diff>
--- a/template/proposal_template.docx
+++ b/template/proposal_template.docx
@@ -358,107 +358,32 @@
       </w:r>
     </w:p>
     <w:p>
-      <w:pPr>
-        <w:pStyle w:val="ListParagraph"/>
-        <w:numPr>
-          <w:ilvl w:val="0"/>
-          <w:numId w:val="2"/>
-        </w:numPr>
+      <w:r>
+        <w:t>{%p for item in toc %}</w:t>
+      </w:r>
+    </w:p>
+    <w:p>
+      <w:pPr>
         <w:pBdr>
           <w:bottom w:val="single" w:sz="2" w:space="4" w:color="D9D9D9"/>
         </w:pBdr>
-        <w:tabs>
-          <w:tab w:val="right" w:pos="9160"/>
-        </w:tabs>
         <w:spacing w:before="60" w:after="60"/>
       </w:pPr>
       <w:r>
-        <w:t>Cover Letter</w:t>
-      </w:r>
-      <w:r>
         <w:rPr>
-          <w:color w:val="595959"/>
+          <w:b/>
+          <w:bCs/>
+          <w:color w:val="1F7A33"/>
         </w:rPr>
-        <w:tab/>
-        <w:t>2</w:t>
-      </w:r>
-    </w:p>
-    <w:p>
-      <w:pPr>
-        <w:pStyle w:val="ListParagraph"/>
-        <w:numPr>
-          <w:ilvl w:val="0"/>
-          <w:numId w:val="2"/>
-        </w:numPr>
-        <w:pBdr>
-          <w:bottom w:val="single" w:sz="2" w:space="4" w:color="D9D9D9"/>
-        </w:pBdr>
-        <w:tabs>
-          <w:tab w:val="right" w:pos="9160"/>
-        </w:tabs>
-        <w:spacing w:before="60" w:after="60"/>
-      </w:pPr>
-      <w:r>
-        <w:t>Scope of Work</w:t>
-      </w:r>
-      <w:r>
-        <w:rPr>
-          <w:color w:val="595959"/>
-        </w:rPr>
-        <w:tab/>
-        <w:t>3</w:t>
-      </w:r>
-    </w:p>
-    <w:p>
-      <w:pPr>
-        <w:pStyle w:val="ListParagraph"/>
-        <w:numPr>
-          <w:ilvl w:val="0"/>
-          <w:numId w:val="2"/>
-        </w:numPr>
-        <w:pBdr>
-          <w:bottom w:val="single" w:sz="2" w:space="4" w:color="D9D9D9"/>
-        </w:pBdr>
-        <w:tabs>
-          <w:tab w:val="right" w:pos="9160"/>
-        </w:tabs>
-        <w:spacing w:before="60" w:after="60"/>
-      </w:pPr>
-      <w:r>
-        <w:t>Investment Options</w:t>
-      </w:r>
-      <w:r>
-        <w:rPr>
-          <w:color w:val="595959"/>
-        </w:rPr>
-        <w:tab/>
-        <w:t>4</w:t>
-      </w:r>
-    </w:p>
-    <w:p>
-      <w:pPr>
-        <w:pStyle w:val="ListParagraph"/>
-        <w:numPr>
-          <w:ilvl w:val="0"/>
-          <w:numId w:val="2"/>
-        </w:numPr>
-        <w:pBdr>
-          <w:bottom w:val="single" w:sz="2" w:space="4" w:color="D9D9D9"/>
-        </w:pBdr>
-        <w:tabs>
-          <w:tab w:val="right" w:pos="9160"/>
-        </w:tabs>
-        <w:spacing w:before="60" w:after="60"/>
-      </w:pPr>
-      <w:r>
-        <w:t>Service Terms</w:t>
-      </w:r>
-      <w:r>
-        <w:rPr>
-          <w:color w:val="595959"/>
-        </w:rPr>
-        <w:tab/>
-        <w:t>5</w:t>
+        <w:t xml:space="preserve">{{ item.num }}.  </w:t>
+      </w:r>
+      <w:r>
+        <w:t>{{ item.title }}</w:t>
+      </w:r>
+    </w:p>
+    <w:p>
+      <w:r>
+        <w:t>{%p endfor %}</w:t>
       </w:r>
     </w:p>
     <w:p>
@@ -499,7 +424,7 @@
                 <w:sz w:val="24"/>
                 <w:szCs w:val="24"/>
               </w:rPr>
-              <w:t>1.  COVER LETTER</w:t>
+              <w:t>{{ num_cover }}.  COVER LETTER</w:t>
             </w:r>
           </w:p>
         </w:tc>
@@ -663,6 +588,11 @@
     </w:p>
     <w:p>
       <w:r>
+        <w:t>{%p for sec in extra_after_cover %}</w:t>
+      </w:r>
+    </w:p>
+    <w:p>
+      <w:r>
         <w:br w:type="page"/>
       </w:r>
     </w:p>
@@ -699,7 +629,115 @@
                 <w:sz w:val="24"/>
                 <w:szCs w:val="24"/>
               </w:rPr>
-              <w:t>2.  SCOPE OF WORK</w:t>
+              <w:t xml:space="preserve">{{ sec.number }}.  </w:t>
+            </w:r>
+            <w:r>
+              <w:rPr>
+                <w:b/>
+                <w:bCs/>
+                <w:color w:val="FFFFFF"/>
+                <w:sz w:val="24"/>
+                <w:szCs w:val="24"/>
+              </w:rPr>
+              <w:t>{{ sec.heading }}</w:t>
+            </w:r>
+          </w:p>
+        </w:tc>
+      </w:tr>
+    </w:tbl>
+    <w:p>
+      <w:pPr>
+        <w:spacing w:after="260"/>
+      </w:pPr>
+    </w:p>
+    <w:p>
+      <w:r>
+        <w:t>{%p for para in sec.paragraphs %}</w:t>
+      </w:r>
+    </w:p>
+    <w:p>
+      <w:pPr>
+        <w:spacing w:after="200"/>
+      </w:pPr>
+      <w:r>
+        <w:t>{{ para }}</w:t>
+      </w:r>
+    </w:p>
+    <w:p>
+      <w:r>
+        <w:t>{%p endfor %}</w:t>
+      </w:r>
+    </w:p>
+    <w:p>
+      <w:r>
+        <w:t>{%p for b in sec.bullets %}</w:t>
+      </w:r>
+    </w:p>
+    <w:p>
+      <w:pPr>
+        <w:spacing w:before="40" w:after="40"/>
+      </w:pPr>
+      <w:r>
+        <w:rPr>
+          <w:b/>
+          <w:bCs/>
+          <w:color w:val="2E9E45"/>
+        </w:rPr>
+        <w:t xml:space="preserve">• </w:t>
+      </w:r>
+      <w:r>
+        <w:t>{{ b }}</w:t>
+      </w:r>
+    </w:p>
+    <w:p>
+      <w:r>
+        <w:t>{%p endfor %}</w:t>
+      </w:r>
+    </w:p>
+    <w:p>
+      <w:r>
+        <w:t>{%p endfor %}</w:t>
+      </w:r>
+    </w:p>
+    <w:p>
+      <w:r>
+        <w:br w:type="page"/>
+      </w:r>
+    </w:p>
+    <w:tbl>
+      <w:tblPr>
+        <w:tblW w:w="9360" w:type="dxa"/>
+        <w:tblCellMar>
+          <w:left w:w="10" w:type="dxa"/>
+          <w:right w:w="10" w:type="dxa"/>
+        </w:tblCellMar>
+        <w:tblLook w:val="04A0" w:firstRow="1" w:lastRow="0" w:firstColumn="1" w:lastColumn="0" w:noHBand="0" w:noVBand="1"/>
+      </w:tblPr>
+      <w:tblGrid>
+        <w:gridCol w:w="9360"/>
+      </w:tblGrid>
+      <w:tr>
+        <w:tc>
+          <w:tcPr>
+            <w:tcW w:w="9360" w:type="dxa"/>
+            <w:shd w:val="clear" w:color="auto" w:fill="2E9E45"/>
+            <w:tcMar>
+              <w:top w:w="60" w:type="dxa"/>
+              <w:left w:w="160" w:type="dxa"/>
+              <w:bottom w:w="60" w:type="dxa"/>
+              <w:right w:w="160" w:type="dxa"/>
+            </w:tcMar>
+          </w:tcPr>
+          <w:p>
+            <w:r>
+              <w:rPr>
+                <w:b/>
+                <w:bCs/>
+                <w:color w:val="FFFFFF"/>
+                <w:sz w:val="24"/>
+                <w:szCs w:val="24"/>
+              </w:rPr>
+              <w:t>{{ num_scope }}.  SCOPE OF WORK</w:t>
             </w:r>
           </w:p>
         </w:tc>
@@ -794,7 +832,7 @@
                 <w:bCs/>
                 <w:color w:val="FFFFFF"/>
               </w:rPr>
-              <w:t>Area</w:t>
+              <w:t>{{ scope_col }}</w:t>
             </w:r>
           </w:p>
         </w:tc>
@@ -994,6 +1032,11 @@
     </w:tbl>
     <w:p>
       <w:r>
+        <w:t>{%p for sec in extra_after_scope %}</w:t>
+      </w:r>
+    </w:p>
+    <w:p>
+      <w:r>
         <w:br w:type="page"/>
       </w:r>
     </w:p>
@@ -1030,7 +1073,115 @@
                 <w:sz w:val="24"/>
                 <w:szCs w:val="24"/>
               </w:rPr>
-              <w:t>3.  INVESTMENT OPTIONS</w:t>
+              <w:t xml:space="preserve">{{ sec.number }}.  </w:t>
+            </w:r>
+            <w:r>
+              <w:rPr>
+                <w:b/>
+                <w:bCs/>
+                <w:color w:val="FFFFFF"/>
+                <w:sz w:val="24"/>
+                <w:szCs w:val="24"/>
+              </w:rPr>
+              <w:t>{{ sec.heading }}</w:t>
+            </w:r>
+          </w:p>
+        </w:tc>
+      </w:tr>
+    </w:tbl>
+    <w:p>
+      <w:pPr>
+        <w:spacing w:after="260"/>
+      </w:pPr>
+    </w:p>
+    <w:p>
+      <w:r>
+        <w:t>{%p for para in sec.paragraphs %}</w:t>
+      </w:r>
+    </w:p>
+    <w:p>
+      <w:pPr>
+        <w:spacing w:after="200"/>
+      </w:pPr>
+      <w:r>
+        <w:t>{{ para }}</w:t>
+      </w:r>
+    </w:p>
+    <w:p>
+      <w:r>
+        <w:t>{%p endfor %}</w:t>
+      </w:r>
+    </w:p>
+    <w:p>
+      <w:r>
+        <w:t>{%p for b in sec.bullets %}</w:t>
+      </w:r>
+    </w:p>
+    <w:p>
+      <w:pPr>
+        <w:spacing w:before="40" w:after="40"/>
+      </w:pPr>
+      <w:r>
+        <w:rPr>
+          <w:b/>
+          <w:bCs/>
+          <w:color w:val="2E9E45"/>
+        </w:rPr>
+        <w:t xml:space="preserve">• </w:t>
+      </w:r>
+      <w:r>
+        <w:t>{{ b }}</w:t>
+      </w:r>
+    </w:p>
+    <w:p>
+      <w:r>
+        <w:t>{%p endfor %}</w:t>
+      </w:r>
+    </w:p>
+    <w:p>
+      <w:r>
+        <w:t>{%p endfor %}</w:t>
+      </w:r>
+    </w:p>
+    <w:p>
+      <w:r>
+        <w:br w:type="page"/>
+      </w:r>
+    </w:p>
+    <w:tbl>
+      <w:tblPr>
+        <w:tblW w:w="9360" w:type="dxa"/>
+        <w:tblCellMar>
+          <w:left w:w="10" w:type="dxa"/>
+          <w:right w:w="10" w:type="dxa"/>
+        </w:tblCellMar>
+        <w:tblLook w:val="04A0" w:firstRow="1" w:lastRow="0" w:firstColumn="1" w:lastColumn="0" w:noHBand="0" w:noVBand="1"/>
+      </w:tblPr>
+      <w:tblGrid>
+        <w:gridCol w:w="9360"/>
+      </w:tblGrid>
+      <w:tr>
+        <w:tc>
+          <w:tcPr>
+            <w:tcW w:w="9360" w:type="dxa"/>
+            <w:shd w:val="clear" w:color="auto" w:fill="2E9E45"/>
+            <w:tcMar>
+              <w:top w:w="60" w:type="dxa"/>
+              <w:left w:w="160" w:type="dxa"/>
+              <w:bottom w:w="60" w:type="dxa"/>
+              <w:right w:w="160" w:type="dxa"/>
+            </w:tcMar>
+          </w:tcPr>
+          <w:p>
+            <w:r>
+              <w:rPr>
+                <w:b/>
+                <w:bCs/>
+                <w:color w:val="FFFFFF"/>
+                <w:sz w:val="24"/>
+                <w:szCs w:val="24"/>
+              </w:rPr>
+              <w:t>{{ num_investment }}.  INVESTMENT OPTIONS</w:t>
             </w:r>
           </w:p>
         </w:tc>
@@ -1449,6 +1600,11 @@
     </w:tbl>
     <w:p>
       <w:r>
+        <w:t>{%p for sec in extra_after_investment %}</w:t>
+      </w:r>
+    </w:p>
+    <w:p>
+      <w:r>
         <w:br w:type="page"/>
       </w:r>
     </w:p>
@@ -1485,7 +1641,115 @@
                 <w:sz w:val="24"/>
                 <w:szCs w:val="24"/>
               </w:rPr>
-              <w:t>4.  SERVICE TERMS</w:t>
+              <w:t xml:space="preserve">{{ sec.number }}.  </w:t>
+            </w:r>
+            <w:r>
+              <w:rPr>
+                <w:b/>
+                <w:bCs/>
+                <w:color w:val="FFFFFF"/>
+                <w:sz w:val="24"/>
+                <w:szCs w:val="24"/>
+              </w:rPr>
+              <w:t>{{ sec.heading }}</w:t>
+            </w:r>
+          </w:p>
+        </w:tc>
+      </w:tr>
+    </w:tbl>
+    <w:p>
+      <w:pPr>
+        <w:spacing w:after="260"/>
+      </w:pPr>
+    </w:p>
+    <w:p>
+      <w:r>
+        <w:t>{%p for para in sec.paragraphs %}</w:t>
+      </w:r>
+    </w:p>
+    <w:p>
+      <w:pPr>
+        <w:spacing w:after="200"/>
+      </w:pPr>
+      <w:r>
+        <w:t>{{ para }}</w:t>
+      </w:r>
+    </w:p>
+    <w:p>
+      <w:r>
+        <w:t>{%p endfor %}</w:t>
+      </w:r>
+    </w:p>
+    <w:p>
+      <w:r>
+        <w:t>{%p for b in sec.bullets %}</w:t>
+      </w:r>
+    </w:p>
+    <w:p>
+      <w:pPr>
+        <w:spacing w:before="40" w:after="40"/>
+      </w:pPr>
+      <w:r>
+        <w:rPr>
+          <w:b/>
+          <w:bCs/>
+          <w:color w:val="2E9E45"/>
+        </w:rPr>
+        <w:t xml:space="preserve">• </w:t>
+      </w:r>
+      <w:r>
+        <w:t>{{ b }}</w:t>
+      </w:r>
+    </w:p>
+    <w:p>
+      <w:r>
+        <w:t>{%p endfor %}</w:t>
+      </w:r>
+    </w:p>
+    <w:p>
+      <w:r>
+        <w:t>{%p endfor %}</w:t>
+      </w:r>
+    </w:p>
+    <w:p>
+      <w:r>
+        <w:br w:type="page"/>
+      </w:r>
+    </w:p>
+    <w:tbl>
+      <w:tblPr>
+        <w:tblW w:w="9360" w:type="dxa"/>
+        <w:tblCellMar>
+          <w:left w:w="10" w:type="dxa"/>
+          <w:right w:w="10" w:type="dxa"/>
+        </w:tblCellMar>
+        <w:tblLook w:val="04A0" w:firstRow="1" w:lastRow="0" w:firstColumn="1" w:lastColumn="0" w:noHBand="0" w:noVBand="1"/>
+      </w:tblPr>
+      <w:tblGrid>
+        <w:gridCol w:w="9360"/>
+      </w:tblGrid>
+      <w:tr>
+        <w:tc>
+          <w:tcPr>
+            <w:tcW w:w="9360" w:type="dxa"/>
+            <w:shd w:val="clear" w:color="auto" w:fill="2E9E45"/>
+            <w:tcMar>
+              <w:top w:w="60" w:type="dxa"/>
+              <w:left w:w="160" w:type="dxa"/>
+              <w:bottom w:w="60" w:type="dxa"/>
+              <w:right w:w="160" w:type="dxa"/>
+            </w:tcMar>
+          </w:tcPr>
+          <w:p>
+            <w:r>
+              <w:rPr>
+                <w:b/>
+                <w:bCs/>
+                <w:color w:val="FFFFFF"/>
+                <w:sz w:val="24"/>
+                <w:szCs w:val="24"/>
+              </w:rPr>
+              <w:t>{{ num_terms }}.  SERVICE TERMS</w:t>
             </w:r>
           </w:p>
         </w:tc>

</xml_diff>

<commit_message>
Proposal page header: green 'ACS Commercial Cleaning' wordmark instead of logo
Co-Authored-By: Claude Opus 4.8 <noreply@anthropic.com>
</commit_message>
<xml_diff>
--- a/template/proposal_template.docx
+++ b/template/proposal_template.docx
@@ -629,17 +629,7 @@
                 <w:sz w:val="24"/>
                 <w:szCs w:val="24"/>
               </w:rPr>
-              <w:t xml:space="preserve">{{ sec.number }}.  </w:t>
-            </w:r>
-            <w:r>
-              <w:rPr>
-                <w:b/>
-                <w:bCs/>
-                <w:color w:val="FFFFFF"/>
-                <w:sz w:val="24"/>
-                <w:szCs w:val="24"/>
-              </w:rPr>
-              <w:t>{{ sec.heading }}</w:t>
+              <w:t>{{ sec.number }}.  {{ sec.heading }}</w:t>
             </w:r>
           </w:p>
         </w:tc>
@@ -1073,17 +1063,7 @@
                 <w:sz w:val="24"/>
                 <w:szCs w:val="24"/>
               </w:rPr>
-              <w:t xml:space="preserve">{{ sec.number }}.  </w:t>
-            </w:r>
-            <w:r>
-              <w:rPr>
-                <w:b/>
-                <w:bCs/>
-                <w:color w:val="FFFFFF"/>
-                <w:sz w:val="24"/>
-                <w:szCs w:val="24"/>
-              </w:rPr>
-              <w:t>{{ sec.heading }}</w:t>
+              <w:t>{{ sec.number }}.  {{ sec.heading }}</w:t>
             </w:r>
           </w:p>
         </w:tc>
@@ -1641,17 +1621,7 @@
                 <w:sz w:val="24"/>
                 <w:szCs w:val="24"/>
               </w:rPr>
-              <w:t xml:space="preserve">{{ sec.number }}.  </w:t>
-            </w:r>
-            <w:r>
-              <w:rPr>
-                <w:b/>
-                <w:bCs/>
-                <w:color w:val="FFFFFF"/>
-                <w:sz w:val="24"/>
-                <w:szCs w:val="24"/>
-              </w:rPr>
-              <w:t>{{ sec.heading }}</w:t>
+              <w:t>{{ sec.number }}.  {{ sec.heading }}</w:t>
             </w:r>
           </w:p>
         </w:tc>
@@ -2129,108 +2099,37 @@
 
 <file path=word/header1.xml><?xml version="1.0" encoding="utf-8"?>
 <w:hdr xmlns:wpc="http://schemas.microsoft.com/office/word/2010/wordprocessingCanvas" xmlns:cx="http://schemas.microsoft.com/office/drawing/2014/chartex" xmlns:cx1="http://schemas.microsoft.com/office/drawing/2015/9/8/chartex" xmlns:cx2="http://schemas.microsoft.com/office/drawing/2015/10/21/chartex" xmlns:cx3="http://schemas.microsoft.com/office/drawing/2016/5/9/chartex" xmlns:cx4="http://schemas.microsoft.com/office/drawing/2016/5/10/chartex" xmlns:cx5="http://schemas.microsoft.com/office/drawing/2016/5/11/chartex" xmlns:cx6="http://schemas.microsoft.com/office/drawing/2016/5/12/chartex" xmlns:cx7="http://schemas.microsoft.com/office/drawing/2016/5/13/chartex" xmlns:cx8="http://schemas.microsoft.com/office/drawing/2016/5/14/chartex" xmlns:mc="http://schemas.openxmlformats.org/markup-compatibility/2006" xmlns:aink="http://schemas.microsoft.com/office/drawing/2016/ink" xmlns:am3d="http://schemas.microsoft.com/office/drawing/2017/model3d" xmlns:o="urn:schemas-microsoft-com:office:office" xmlns:oel="http://schemas.microsoft.com/office/2019/extlst" xmlns:r="http://schemas.openxmlformats.org/officeDocument/2006/relationships" xmlns:m="http://schemas.openxmlformats.org/officeDocument/2006/math" xmlns:v="urn:schemas-microsoft-com:vml" xmlns:wp14="http://schemas.microsoft.com/office/word/2010/wordprocessingDrawing" xmlns:wp="http://schemas.openxmlformats.org/drawingml/2006/wordprocessingDrawing" xmlns:w10="urn:schemas-microsoft-com:office:word" xmlns:w="http://schemas.openxmlformats.org/wordprocessingml/2006/main" xmlns:w14="http://schemas.microsoft.com/office/word/2010/wordml" xmlns:w15="http://schemas.microsoft.com/office/word/2012/wordml" xmlns:w16cex="http://schemas.microsoft.com/office/word/2018/wordml/cex" xmlns:w16cid="http://schemas.microsoft.com/office/word/2016/wordml/cid" xmlns:w16="http://schemas.microsoft.com/office/word/2018/wordml" xmlns:w16du="http://schemas.microsoft.com/office/word/2023/wordml/word16du" xmlns:w16sdtdh="http://schemas.microsoft.com/office/word/2020/wordml/sdtdatahash" xmlns:w16sdtfl="http://schemas.microsoft.com/office/word/2024/wordml/sdtformatlock" xmlns:w16se="http://schemas.microsoft.com/office/word/2015/wordml/symex" xmlns:wpg="http://schemas.microsoft.com/office/word/2010/wordprocessingGroup" xmlns:wpi="http://schemas.microsoft.com/office/word/2010/wordprocessingInk" xmlns:wne="http://schemas.microsoft.com/office/word/2006/wordml" xmlns:wps="http://schemas.microsoft.com/office/word/2010/wordprocessingShape" mc:Ignorable="w14 w15 w16se w16cid w16 w16cex w16sdtdh w16sdtfl w16du wp14">
-  <w:tbl>
-    <w:tblPr>
-      <w:tblW w:w="9360" w:type="dxa"/>
-      <w:tblCellMar>
-        <w:left w:w="10" w:type="dxa"/>
-        <w:right w:w="10" w:type="dxa"/>
-      </w:tblCellMar>
-      <w:tblLook w:val="04A0" w:firstRow="1" w:lastRow="0" w:firstColumn="1" w:lastColumn="0" w:noHBand="0" w:noVBand="1"/>
-    </w:tblPr>
-    <w:tblGrid>
-      <w:gridCol w:w="2200"/>
-      <w:gridCol w:w="7160"/>
-    </w:tblGrid>
-    <w:tr>
-      <w:tblPrEx>
-        <w:tblCellMar>
-          <w:top w:w="0" w:type="dxa"/>
-          <w:bottom w:w="0" w:type="dxa"/>
-        </w:tblCellMar>
-      </w:tblPrEx>
-      <w:tc>
-        <w:tcPr>
-          <w:tcW w:w="2200" w:type="dxa"/>
-          <w:vAlign w:val="center"/>
-        </w:tcPr>
-        <w:p>
-          <w:r>
-            <w:rPr>
-              <w:noProof/>
-            </w:rPr>
-            <w:drawing>
-              <wp:inline distT="0" distB="0" distL="0" distR="0" wp14:anchorId="1B7E3F05" wp14:editId="554450BF">
-                <wp:extent cx="1238250" cy="447675"/>
-                <wp:effectExtent l="0" t="0" r="0" b="0"/>
-                <wp:docPr id="2017328193" name="Picture 2017328193"/>
-                <wp:cNvGraphicFramePr>
-                  <a:graphicFrameLocks xmlns:a="http://schemas.openxmlformats.org/drawingml/2006/main" noChangeAspect="1"/>
-                </wp:cNvGraphicFramePr>
-                <a:graphic xmlns:a="http://schemas.openxmlformats.org/drawingml/2006/main">
-                  <a:graphicData uri="http://schemas.openxmlformats.org/drawingml/2006/picture">
-                    <pic:pic xmlns:pic="http://schemas.openxmlformats.org/drawingml/2006/picture">
-                      <pic:nvPicPr>
-                        <pic:cNvPr id="0" name=""/>
-                        <pic:cNvPicPr>
-                          <a:picLocks noChangeAspect="1" noChangeArrowheads="1"/>
-                        </pic:cNvPicPr>
-                      </pic:nvPicPr>
-                      <pic:blipFill>
-                        <a:blip r:embed="rId1"/>
-                        <a:srcRect/>
-                        <a:stretch>
-                          <a:fillRect/>
-                        </a:stretch>
-                      </pic:blipFill>
-                      <pic:spPr bwMode="auto">
-                        <a:xfrm>
-                          <a:off x="0" y="0"/>
-                          <a:ext cx="1238250" cy="447675"/>
-                        </a:xfrm>
-                        <a:prstGeom prst="rect">
-                          <a:avLst/>
-                        </a:prstGeom>
-                      </pic:spPr>
-                    </pic:pic>
-                  </a:graphicData>
-                </a:graphic>
-              </wp:inline>
-            </w:drawing>
-          </w:r>
-        </w:p>
-      </w:tc>
-      <w:tc>
-        <w:tcPr>
-          <w:tcW w:w="7160" w:type="dxa"/>
-          <w:vAlign w:val="center"/>
-        </w:tcPr>
-        <w:p>
-          <w:r>
-            <w:rPr>
-              <w:color w:val="595959"/>
-            </w:rPr>
-            <w:t xml:space="preserve">|   Proposal for </w:t>
-          </w:r>
-          <w:r>
-            <w:rPr>
-              <w:b/>
-              <w:bCs/>
-              <w:color w:val="1F7A33"/>
-            </w:rPr>
-            <w:t>{{ client_name }}</w:t>
-          </w:r>
-        </w:p>
-      </w:tc>
-    </w:tr>
-  </w:tbl>
   <w:p>
     <w:pPr>
       <w:pBdr>
-        <w:bottom w:val="single" w:sz="4" w:space="1" w:color="D9D9D9"/>
+        <w:bottom w:val="single" w:sz="4" w:space="4" w:color="D9D9D9"/>
       </w:pBdr>
-      <w:spacing w:before="40"/>
+      <w:spacing w:before="40" w:after="40"/>
     </w:pPr>
+    <w:r>
+      <w:rPr>
+        <w:b/>
+        <w:bCs/>
+        <w:color w:val="1F7A33"/>
+        <w:sz w:val="24"/>
+        <w:szCs w:val="24"/>
+      </w:rPr>
+      <w:t>ACS Commercial Cleaning</w:t>
+    </w:r>
+    <w:r>
+      <w:rPr>
+        <w:color w:val="595959"/>
+      </w:rPr>
+      <w:t xml:space="preserve">   |   Proposal for </w:t>
+    </w:r>
+    <w:r>
+      <w:rPr>
+        <w:b/>
+        <w:bCs/>
+        <w:color w:val="1F7A33"/>
+      </w:rPr>
+      <w:t>{{ client_name }}</w:t>
+    </w:r>
   </w:p>
 </w:hdr>
 </file>

</xml_diff>

<commit_message>
Cover-letter recipient box: labelled Date/Client/Contact/Position/Phone format
Co-Authored-By: Claude Opus 4.8 <noreply@anthropic.com>
</commit_message>
<xml_diff>
--- a/template/proposal_template.docx
+++ b/template/proposal_template.docx
@@ -435,19 +435,6 @@
         <w:spacing w:after="260"/>
       </w:pPr>
     </w:p>
-    <w:p>
-      <w:pPr>
-        <w:spacing w:after="200"/>
-      </w:pPr>
-      <w:r>
-        <w:rPr>
-          <w:b/>
-          <w:bCs/>
-          <w:color w:val="1F7A33"/>
-        </w:rPr>
-        <w:t>{{ date }}</w:t>
-      </w:r>
-    </w:p>
     <w:tbl>
       <w:tblPr>
         <w:tblW w:w="9360" w:type="dxa"/>
@@ -477,29 +464,89 @@
           </w:tcPr>
           <w:p>
             <w:pPr>
-              <w:spacing w:after="40"/>
+              <w:spacing w:after="20"/>
             </w:pPr>
             <w:r>
               <w:rPr>
                 <w:b/>
                 <w:bCs/>
-                <w:color w:val="1F7A33"/>
+              </w:rPr>
+              <w:t xml:space="preserve">Date   </w:t>
+            </w:r>
+            <w:r>
+              <w:rPr>
+                <w:color w:val="595959"/>
+              </w:rPr>
+              <w:t>{{ date }}</w:t>
+            </w:r>
+          </w:p>
+          <w:p>
+            <w:pPr>
+              <w:spacing w:after="20"/>
+            </w:pPr>
+            <w:r>
+              <w:rPr>
+                <w:b/>
+                <w:bCs/>
+              </w:rPr>
+              <w:t xml:space="preserve">Client Name   </w:t>
+            </w:r>
+            <w:r>
+              <w:rPr>
+                <w:color w:val="595959"/>
+              </w:rPr>
+              <w:t>{{ client_name }}</w:t>
+            </w:r>
+          </w:p>
+          <w:p>
+            <w:pPr>
+              <w:spacing w:after="20"/>
+            </w:pPr>
+            <w:r>
+              <w:rPr>
+                <w:b/>
+                <w:bCs/>
+              </w:rPr>
+              <w:t xml:space="preserve">Contact   </w:t>
+            </w:r>
+            <w:r>
+              <w:rPr>
+                <w:color w:val="595959"/>
               </w:rPr>
               <w:t>{{ contact_name }}</w:t>
             </w:r>
+          </w:p>
+          <w:p>
+            <w:pPr>
+              <w:spacing w:after="20"/>
+            </w:pPr>
+            <w:r>
+              <w:rPr>
+                <w:b/>
+                <w:bCs/>
+              </w:rPr>
+              <w:t xml:space="preserve">Position   </w:t>
+            </w:r>
             <w:r>
               <w:rPr>
                 <w:color w:val="595959"/>
               </w:rPr>
-              <w:t xml:space="preserve"> {{ contact_title }}, {{ client_name }}</w:t>
-            </w:r>
-          </w:p>
-          <w:p>
+              <w:t>{{ contact_title }}</w:t>
+            </w:r>
+          </w:p>
+          <w:p>
+            <w:r>
+              <w:rPr>
+                <w:b/>
+                <w:bCs/>
+              </w:rPr>
+              <w:t xml:space="preserve">Phone   </w:t>
+            </w:r>
             <w:r>
               <w:rPr>
                 <w:color w:val="595959"/>
               </w:rPr>
-              <w:t>{{ client_address }} · {{ contact_phone }}</w:t>
+              <w:t>{{ contact_phone }}</w:t>
             </w:r>
           </w:p>
         </w:tc>

</xml_diff>

<commit_message>
Re-integrate optional sections into C2 design: dynamic numbering, dynamic TOC, C2-styled optional section bars
Co-Authored-By: Claude Opus 4.8 <noreply@anthropic.com>
</commit_message>
<xml_diff>
--- a/template/proposal_template.docx
+++ b/template/proposal_template.docx
@@ -360,124 +360,42 @@
       </w:r>
     </w:p>
     <w:p>
+      <w:r>
+        <w:t xml:space="preserve">{%p for item in toc %}</w:t>
+      </w:r>
+    </w:p>
+    <w:p>
       <w:pPr>
         <w:tabs>
           <w:tab w:val="right" w:pos="9360" w:leader="dot"/>
         </w:tabs>
         <w:spacing w:after="180" w:before="0"/>
       </w:pPr>
-      <w:hyperlink w:history="1" w:anchor="sec_cover_letter">
-        <w:r>
-          <w:rPr>
-            <w:rFonts w:ascii="Calibri" w:cs="Calibri" w:eastAsia="Calibri" w:hAnsi="Calibri"/>
-            <w:b/>
-            <w:bCs/>
-            <w:color w:val="1E8A45"/>
-            <w:sz w:val="22"/>
-            <w:szCs w:val="22"/>
-          </w:rPr>
-          <w:t xml:space="preserve">01</w:t>
-        </w:r>
-        <w:r>
-          <w:rPr>
-            <w:rFonts w:ascii="Calibri" w:cs="Calibri" w:eastAsia="Calibri" w:hAnsi="Calibri"/>
-            <w:color w:val="1F3A2E"/>
-            <w:sz w:val="22"/>
-            <w:szCs w:val="22"/>
-          </w:rPr>
-          <w:t xml:space="preserve">       Cover Letter</w:t>
-        </w:r>
-      </w:hyperlink>
-    </w:p>
-    <w:p>
-      <w:pPr>
-        <w:tabs>
-          <w:tab w:val="right" w:pos="9360" w:leader="dot"/>
-        </w:tabs>
-        <w:spacing w:after="180" w:before="0"/>
-      </w:pPr>
-      <w:hyperlink w:history="1" w:anchor="sec_scope">
-        <w:r>
-          <w:rPr>
-            <w:rFonts w:ascii="Calibri" w:cs="Calibri" w:eastAsia="Calibri" w:hAnsi="Calibri"/>
-            <w:b/>
-            <w:bCs/>
-            <w:color w:val="1E8A45"/>
-            <w:sz w:val="22"/>
-            <w:szCs w:val="22"/>
-          </w:rPr>
-          <w:t xml:space="preserve">02</w:t>
-        </w:r>
-        <w:r>
-          <w:rPr>
-            <w:rFonts w:ascii="Calibri" w:cs="Calibri" w:eastAsia="Calibri" w:hAnsi="Calibri"/>
-            <w:color w:val="1F3A2E"/>
-            <w:sz w:val="22"/>
-            <w:szCs w:val="22"/>
-          </w:rPr>
-          <w:t xml:space="preserve">       Scope of Work</w:t>
-        </w:r>
-      </w:hyperlink>
-    </w:p>
-    <w:p>
-      <w:pPr>
-        <w:tabs>
-          <w:tab w:val="right" w:pos="9360" w:leader="dot"/>
-        </w:tabs>
-        <w:spacing w:after="180" w:before="0"/>
-      </w:pPr>
-      <w:hyperlink w:history="1" w:anchor="sec_investment">
-        <w:r>
-          <w:rPr>
-            <w:rFonts w:ascii="Calibri" w:cs="Calibri" w:eastAsia="Calibri" w:hAnsi="Calibri"/>
-            <w:b/>
-            <w:bCs/>
-            <w:color w:val="1E8A45"/>
-            <w:sz w:val="22"/>
-            <w:szCs w:val="22"/>
-          </w:rPr>
-          <w:t xml:space="preserve">03</w:t>
-        </w:r>
-        <w:r>
-          <w:rPr>
-            <w:rFonts w:ascii="Calibri" w:cs="Calibri" w:eastAsia="Calibri" w:hAnsi="Calibri"/>
-            <w:color w:val="1F3A2E"/>
-            <w:sz w:val="22"/>
-            <w:szCs w:val="22"/>
-          </w:rPr>
-          <w:t xml:space="preserve">       Investment Options</w:t>
-        </w:r>
-      </w:hyperlink>
-    </w:p>
-    <w:p>
-      <w:pPr>
-        <w:tabs>
-          <w:tab w:val="right" w:pos="9360" w:leader="dot"/>
-        </w:tabs>
-        <w:spacing w:after="180" w:before="0"/>
-      </w:pPr>
-      <w:hyperlink w:history="1" w:anchor="sec_terms">
-        <w:r>
-          <w:rPr>
-            <w:rFonts w:ascii="Calibri" w:cs="Calibri" w:eastAsia="Calibri" w:hAnsi="Calibri"/>
-            <w:b/>
-            <w:bCs/>
-            <w:color w:val="1E8A45"/>
-            <w:sz w:val="22"/>
-            <w:szCs w:val="22"/>
-          </w:rPr>
-          <w:t xml:space="preserve">04</w:t>
-        </w:r>
-        <w:r>
-          <w:rPr>
-            <w:rFonts w:ascii="Calibri" w:cs="Calibri" w:eastAsia="Calibri" w:hAnsi="Calibri"/>
-            <w:color w:val="1F3A2E"/>
-            <w:sz w:val="22"/>
-            <w:szCs w:val="22"/>
-          </w:rPr>
-          <w:t xml:space="preserve">       Service Terms</w:t>
-        </w:r>
-      </w:hyperlink>
+      <w:r>
+        <w:rPr>
+          <w:rFonts w:ascii="Calibri" w:cs="Calibri" w:eastAsia="Calibri" w:hAnsi="Calibri"/>
+          <w:b/>
+          <w:bCs/>
+          <w:color w:val="1E8A45"/>
+          <w:sz w:val="22"/>
+          <w:szCs w:val="22"/>
+        </w:rPr>
+        <w:t xml:space="preserve">{{ item.num }}</w:t>
+      </w:r>
+      <w:r>
+        <w:rPr>
+          <w:rFonts w:ascii="Calibri" w:cs="Calibri" w:eastAsia="Calibri" w:hAnsi="Calibri"/>
+          <w:color w:val="1F3A2E"/>
+          <w:sz w:val="22"/>
+          <w:szCs w:val="22"/>
+        </w:rPr>
+        <w:t xml:space="preserve">       {{ item.title }}</w:t>
+      </w:r>
+    </w:p>
+    <w:p>
+      <w:r>
+        <w:t xml:space="preserve">{%p endfor %}</w:t>
+      </w:r>
     </w:p>
     <w:p>
       <w:pPr>
@@ -533,7 +451,7 @@
                 <w:sz w:val="26"/>
                 <w:szCs w:val="26"/>
               </w:rPr>
-              <w:t xml:space="preserve">01    </w:t>
+              <w:t xml:space="preserve">{{ num_cover }}    </w:t>
             </w:r>
             <w:r>
               <w:rPr>
@@ -845,16 +763,14 @@
       </w:r>
     </w:p>
     <w:p>
-      <w:pPr>
-        <w:sectPr>
-          <w:headerReference w:type="default" r:id="rId8"/>
-          <w:footerReference w:type="default" r:id="rId9"/>
-          <w:pgSz w:w="12240" w:h="15840" w:orient="portrait"/>
-          <w:pgMar w:top="1100" w:right="1440" w:bottom="1100" w:left="1440" w:header="708" w:footer="708" w:gutter="0"/>
-          <w:pgNumType/>
-          <w:docGrid w:linePitch="360"/>
-        </w:sectPr>
-      </w:pPr>
+      <w:r>
+        <w:t xml:space="preserve">{%p for sec in extra_after_cover %}</w:t>
+      </w:r>
+    </w:p>
+    <w:p>
+      <w:r>
+        <w:br w:type="page"/>
+      </w:r>
     </w:p>
     <w:tbl>
       <w:tblPr>
@@ -888,7 +804,6 @@
             <w:pPr>
               <w:spacing w:after="0" w:before="0"/>
             </w:pPr>
-            <w:bookmarkStart w:name="sec_scope" w:id="102"/>
             <w:r>
               <w:rPr>
                 <w:rFonts w:ascii="Calibri" w:cs="Calibri" w:eastAsia="Calibri" w:hAnsi="Calibri"/>
@@ -898,7 +813,160 @@
                 <w:sz w:val="26"/>
                 <w:szCs w:val="26"/>
               </w:rPr>
-              <w:t xml:space="preserve">02    </w:t>
+              <w:t xml:space="preserve">{{ sec.number }}    </w:t>
+            </w:r>
+            <w:r>
+              <w:rPr>
+                <w:rFonts w:ascii="Calibri" w:cs="Calibri" w:eastAsia="Calibri" w:hAnsi="Calibri"/>
+                <w:b/>
+                <w:bCs/>
+                <w:color w:val="FFFFFF"/>
+                <w:spacing w:val="20"/>
+                <w:sz w:val="26"/>
+                <w:szCs w:val="26"/>
+              </w:rPr>
+              <w:t xml:space="preserve">{{ sec.heading }}</w:t>
+            </w:r>
+          </w:p>
+        </w:tc>
+      </w:tr>
+    </w:tbl>
+    <w:p>
+      <w:pPr>
+        <w:spacing w:after="280" w:before="0"/>
+      </w:pPr>
+    </w:p>
+    <w:p>
+      <w:r>
+        <w:t xml:space="preserve">{%p for para in sec.paragraphs %}</w:t>
+      </w:r>
+    </w:p>
+    <w:p>
+      <w:pPr>
+        <w:spacing w:after="180" w:before="0" w:line="276"/>
+      </w:pPr>
+      <w:r>
+        <w:rPr>
+          <w:rFonts w:ascii="Calibri" w:cs="Calibri" w:eastAsia="Calibri" w:hAnsi="Calibri"/>
+          <w:color w:val="2B2B2B"/>
+          <w:sz w:val="21"/>
+          <w:szCs w:val="21"/>
+        </w:rPr>
+        <w:t xml:space="preserve">{{ para }}</w:t>
+      </w:r>
+    </w:p>
+    <w:p>
+      <w:r>
+        <w:t xml:space="preserve">{%p endfor %}</w:t>
+      </w:r>
+    </w:p>
+    <w:p>
+      <w:r>
+        <w:t xml:space="preserve">{%p for b in sec.bullets %}</w:t>
+      </w:r>
+    </w:p>
+    <w:p>
+      <w:pPr>
+        <w:tabs>
+          <w:tab w:val="left" w:pos="320"/>
+        </w:tabs>
+        <w:spacing w:after="60" w:before="60" w:line="264"/>
+        <w:ind w:left="320" w:hanging="250"/>
+      </w:pPr>
+      <w:r>
+        <w:rPr>
+          <w:rFonts w:ascii="Calibri" w:cs="Calibri" w:eastAsia="Calibri" w:hAnsi="Calibri"/>
+          <w:b/>
+          <w:bCs/>
+          <w:color w:val="1E8A45"/>
+          <w:sz w:val="20"/>
+          <w:szCs w:val="20"/>
+        </w:rPr>
+        <w:t xml:space="preserve">•</w:t>
+      </w:r>
+      <w:r>
+        <w:rPr>
+          <w:rFonts w:ascii="Calibri" w:cs="Calibri" w:eastAsia="Calibri" w:hAnsi="Calibri"/>
+          <w:sz w:val="20"/>
+          <w:szCs w:val="20"/>
+        </w:rPr>
+        <w:tab/>
+      </w:r>
+      <w:r>
+        <w:rPr>
+          <w:rFonts w:ascii="Calibri" w:cs="Calibri" w:eastAsia="Calibri" w:hAnsi="Calibri"/>
+          <w:color w:val="2B2B2B"/>
+          <w:sz w:val="20"/>
+          <w:szCs w:val="20"/>
+        </w:rPr>
+        <w:t xml:space="preserve">{{ b }}</w:t>
+      </w:r>
+    </w:p>
+    <w:p>
+      <w:r>
+        <w:t xml:space="preserve">{%p endfor %}</w:t>
+      </w:r>
+    </w:p>
+    <w:p>
+      <w:r>
+        <w:t xml:space="preserve">{%p endfor %}</w:t>
+      </w:r>
+    </w:p>
+    <w:p>
+      <w:pPr>
+        <w:sectPr>
+          <w:headerReference w:type="default" r:id="rId8"/>
+          <w:footerReference w:type="default" r:id="rId9"/>
+          <w:pgSz w:w="12240" w:h="15840" w:orient="portrait"/>
+          <w:pgMar w:top="1100" w:right="1440" w:bottom="1100" w:left="1440" w:header="708" w:footer="708" w:gutter="0"/>
+          <w:pgNumType/>
+          <w:docGrid w:linePitch="360"/>
+        </w:sectPr>
+      </w:pPr>
+    </w:p>
+    <w:tbl>
+      <w:tblPr>
+        <w:tblW w:type="dxa" w:w="9360"/>
+        <w:tblBorders>
+          <w:top w:val="none"/>
+          <w:left w:val="none"/>
+          <w:bottom w:val="none"/>
+          <w:right w:val="none"/>
+          <w:insideH w:val="none"/>
+          <w:insideV w:val="none"/>
+        </w:tblBorders>
+      </w:tblPr>
+      <w:tblGrid>
+        <w:gridCol w:w="9360"/>
+      </w:tblGrid>
+      <w:tr>
+        <w:tc>
+          <w:tcPr>
+            <w:tcW w:type="dxa" w:w="9360"/>
+            <w:shd w:fill="1E8A45" w:val="clear"/>
+            <w:tcMar>
+              <w:top w:type="dxa" w:w="130"/>
+              <w:left w:type="dxa" w:w="200"/>
+              <w:bottom w:type="dxa" w:w="130"/>
+              <w:right w:type="dxa" w:w="200"/>
+            </w:tcMar>
+            <w:vAlign w:val="center"/>
+          </w:tcPr>
+          <w:p>
+            <w:pPr>
+              <w:spacing w:after="0" w:before="0"/>
+            </w:pPr>
+            <w:bookmarkStart w:name="sec_scope" w:id="102"/>
+            <w:r>
+              <w:rPr>
+                <w:rFonts w:ascii="Calibri" w:cs="Calibri" w:eastAsia="Calibri" w:hAnsi="Calibri"/>
+                <w:b/>
+                <w:bCs/>
+                <w:color w:val="FFFFFF"/>
+                <w:sz w:val="26"/>
+                <w:szCs w:val="26"/>
+              </w:rPr>
+              <w:t xml:space="preserve">{{ num_scope }}    </w:t>
             </w:r>
             <w:r>
               <w:rPr>
@@ -1397,16 +1465,14 @@
       </w:tr>
     </w:tbl>
     <w:p>
-      <w:pPr>
-        <w:sectPr>
-          <w:headerReference w:type="default" r:id="rId10"/>
-          <w:footerReference w:type="default" r:id="rId11"/>
-          <w:pgSz w:w="12240" w:h="15840" w:orient="portrait"/>
-          <w:pgMar w:top="1100" w:right="1440" w:bottom="1100" w:left="1440" w:header="708" w:footer="708" w:gutter="0"/>
-          <w:pgNumType/>
-          <w:docGrid w:linePitch="360"/>
-        </w:sectPr>
-      </w:pPr>
+      <w:r>
+        <w:t xml:space="preserve">{%p for sec in extra_after_scope %}</w:t>
+      </w:r>
+    </w:p>
+    <w:p>
+      <w:r>
+        <w:br w:type="page"/>
+      </w:r>
     </w:p>
     <w:tbl>
       <w:tblPr>
@@ -1440,7 +1506,6 @@
             <w:pPr>
               <w:spacing w:after="0" w:before="0"/>
             </w:pPr>
-            <w:bookmarkStart w:name="sec_investment" w:id="103"/>
             <w:r>
               <w:rPr>
                 <w:rFonts w:ascii="Calibri" w:cs="Calibri" w:eastAsia="Calibri" w:hAnsi="Calibri"/>
@@ -1450,7 +1515,160 @@
                 <w:sz w:val="26"/>
                 <w:szCs w:val="26"/>
               </w:rPr>
-              <w:t xml:space="preserve">03    </w:t>
+              <w:t xml:space="preserve">{{ sec.number }}    </w:t>
+            </w:r>
+            <w:r>
+              <w:rPr>
+                <w:rFonts w:ascii="Calibri" w:cs="Calibri" w:eastAsia="Calibri" w:hAnsi="Calibri"/>
+                <w:b/>
+                <w:bCs/>
+                <w:color w:val="FFFFFF"/>
+                <w:spacing w:val="20"/>
+                <w:sz w:val="26"/>
+                <w:szCs w:val="26"/>
+              </w:rPr>
+              <w:t xml:space="preserve">{{ sec.heading }}</w:t>
+            </w:r>
+          </w:p>
+        </w:tc>
+      </w:tr>
+    </w:tbl>
+    <w:p>
+      <w:pPr>
+        <w:spacing w:after="280" w:before="0"/>
+      </w:pPr>
+    </w:p>
+    <w:p>
+      <w:r>
+        <w:t xml:space="preserve">{%p for para in sec.paragraphs %}</w:t>
+      </w:r>
+    </w:p>
+    <w:p>
+      <w:pPr>
+        <w:spacing w:after="180" w:before="0" w:line="276"/>
+      </w:pPr>
+      <w:r>
+        <w:rPr>
+          <w:rFonts w:ascii="Calibri" w:cs="Calibri" w:eastAsia="Calibri" w:hAnsi="Calibri"/>
+          <w:color w:val="2B2B2B"/>
+          <w:sz w:val="21"/>
+          <w:szCs w:val="21"/>
+        </w:rPr>
+        <w:t xml:space="preserve">{{ para }}</w:t>
+      </w:r>
+    </w:p>
+    <w:p>
+      <w:r>
+        <w:t xml:space="preserve">{%p endfor %}</w:t>
+      </w:r>
+    </w:p>
+    <w:p>
+      <w:r>
+        <w:t xml:space="preserve">{%p for b in sec.bullets %}</w:t>
+      </w:r>
+    </w:p>
+    <w:p>
+      <w:pPr>
+        <w:tabs>
+          <w:tab w:val="left" w:pos="320"/>
+        </w:tabs>
+        <w:spacing w:after="60" w:before="60" w:line="264"/>
+        <w:ind w:left="320" w:hanging="250"/>
+      </w:pPr>
+      <w:r>
+        <w:rPr>
+          <w:rFonts w:ascii="Calibri" w:cs="Calibri" w:eastAsia="Calibri" w:hAnsi="Calibri"/>
+          <w:b/>
+          <w:bCs/>
+          <w:color w:val="1E8A45"/>
+          <w:sz w:val="20"/>
+          <w:szCs w:val="20"/>
+        </w:rPr>
+        <w:t xml:space="preserve">•</w:t>
+      </w:r>
+      <w:r>
+        <w:rPr>
+          <w:rFonts w:ascii="Calibri" w:cs="Calibri" w:eastAsia="Calibri" w:hAnsi="Calibri"/>
+          <w:sz w:val="20"/>
+          <w:szCs w:val="20"/>
+        </w:rPr>
+        <w:tab/>
+      </w:r>
+      <w:r>
+        <w:rPr>
+          <w:rFonts w:ascii="Calibri" w:cs="Calibri" w:eastAsia="Calibri" w:hAnsi="Calibri"/>
+          <w:color w:val="2B2B2B"/>
+          <w:sz w:val="20"/>
+          <w:szCs w:val="20"/>
+        </w:rPr>
+        <w:t xml:space="preserve">{{ b }}</w:t>
+      </w:r>
+    </w:p>
+    <w:p>
+      <w:r>
+        <w:t xml:space="preserve">{%p endfor %}</w:t>
+      </w:r>
+    </w:p>
+    <w:p>
+      <w:r>
+        <w:t xml:space="preserve">{%p endfor %}</w:t>
+      </w:r>
+    </w:p>
+    <w:p>
+      <w:pPr>
+        <w:sectPr>
+          <w:headerReference w:type="default" r:id="rId10"/>
+          <w:footerReference w:type="default" r:id="rId11"/>
+          <w:pgSz w:w="12240" w:h="15840" w:orient="portrait"/>
+          <w:pgMar w:top="1100" w:right="1440" w:bottom="1100" w:left="1440" w:header="708" w:footer="708" w:gutter="0"/>
+          <w:pgNumType/>
+          <w:docGrid w:linePitch="360"/>
+        </w:sectPr>
+      </w:pPr>
+    </w:p>
+    <w:tbl>
+      <w:tblPr>
+        <w:tblW w:type="dxa" w:w="9360"/>
+        <w:tblBorders>
+          <w:top w:val="none"/>
+          <w:left w:val="none"/>
+          <w:bottom w:val="none"/>
+          <w:right w:val="none"/>
+          <w:insideH w:val="none"/>
+          <w:insideV w:val="none"/>
+        </w:tblBorders>
+      </w:tblPr>
+      <w:tblGrid>
+        <w:gridCol w:w="9360"/>
+      </w:tblGrid>
+      <w:tr>
+        <w:tc>
+          <w:tcPr>
+            <w:tcW w:type="dxa" w:w="9360"/>
+            <w:shd w:fill="1E8A45" w:val="clear"/>
+            <w:tcMar>
+              <w:top w:type="dxa" w:w="130"/>
+              <w:left w:type="dxa" w:w="200"/>
+              <w:bottom w:type="dxa" w:w="130"/>
+              <w:right w:type="dxa" w:w="200"/>
+            </w:tcMar>
+            <w:vAlign w:val="center"/>
+          </w:tcPr>
+          <w:p>
+            <w:pPr>
+              <w:spacing w:after="0" w:before="0"/>
+            </w:pPr>
+            <w:bookmarkStart w:name="sec_investment" w:id="103"/>
+            <w:r>
+              <w:rPr>
+                <w:rFonts w:ascii="Calibri" w:cs="Calibri" w:eastAsia="Calibri" w:hAnsi="Calibri"/>
+                <w:b/>
+                <w:bCs/>
+                <w:color w:val="FFFFFF"/>
+                <w:sz w:val="26"/>
+                <w:szCs w:val="26"/>
+              </w:rPr>
+              <w:t xml:space="preserve">{{ num_investment }}    </w:t>
             </w:r>
             <w:r>
               <w:rPr>
@@ -2034,16 +2252,14 @@
       </w:tr>
     </w:tbl>
     <w:p>
-      <w:pPr>
-        <w:sectPr>
-          <w:headerReference w:type="default" r:id="rId12"/>
-          <w:footerReference w:type="default" r:id="rId13"/>
-          <w:pgSz w:w="12240" w:h="15840" w:orient="portrait"/>
-          <w:pgMar w:top="1100" w:right="1440" w:bottom="1100" w:left="1440" w:header="708" w:footer="708" w:gutter="0"/>
-          <w:pgNumType/>
-          <w:docGrid w:linePitch="360"/>
-        </w:sectPr>
-      </w:pPr>
+      <w:r>
+        <w:t xml:space="preserve">{%p for sec in extra_after_investment %}</w:t>
+      </w:r>
+    </w:p>
+    <w:p>
+      <w:r>
+        <w:br w:type="page"/>
+      </w:r>
     </w:p>
     <w:tbl>
       <w:tblPr>
@@ -2077,7 +2293,6 @@
             <w:pPr>
               <w:spacing w:after="0" w:before="0"/>
             </w:pPr>
-            <w:bookmarkStart w:name="sec_terms" w:id="104"/>
             <w:r>
               <w:rPr>
                 <w:rFonts w:ascii="Calibri" w:cs="Calibri" w:eastAsia="Calibri" w:hAnsi="Calibri"/>
@@ -2087,7 +2302,160 @@
                 <w:sz w:val="26"/>
                 <w:szCs w:val="26"/>
               </w:rPr>
-              <w:t xml:space="preserve">04    </w:t>
+              <w:t xml:space="preserve">{{ sec.number }}    </w:t>
+            </w:r>
+            <w:r>
+              <w:rPr>
+                <w:rFonts w:ascii="Calibri" w:cs="Calibri" w:eastAsia="Calibri" w:hAnsi="Calibri"/>
+                <w:b/>
+                <w:bCs/>
+                <w:color w:val="FFFFFF"/>
+                <w:spacing w:val="20"/>
+                <w:sz w:val="26"/>
+                <w:szCs w:val="26"/>
+              </w:rPr>
+              <w:t xml:space="preserve">{{ sec.heading }}</w:t>
+            </w:r>
+          </w:p>
+        </w:tc>
+      </w:tr>
+    </w:tbl>
+    <w:p>
+      <w:pPr>
+        <w:spacing w:after="280" w:before="0"/>
+      </w:pPr>
+    </w:p>
+    <w:p>
+      <w:r>
+        <w:t xml:space="preserve">{%p for para in sec.paragraphs %}</w:t>
+      </w:r>
+    </w:p>
+    <w:p>
+      <w:pPr>
+        <w:spacing w:after="180" w:before="0" w:line="276"/>
+      </w:pPr>
+      <w:r>
+        <w:rPr>
+          <w:rFonts w:ascii="Calibri" w:cs="Calibri" w:eastAsia="Calibri" w:hAnsi="Calibri"/>
+          <w:color w:val="2B2B2B"/>
+          <w:sz w:val="21"/>
+          <w:szCs w:val="21"/>
+        </w:rPr>
+        <w:t xml:space="preserve">{{ para }}</w:t>
+      </w:r>
+    </w:p>
+    <w:p>
+      <w:r>
+        <w:t xml:space="preserve">{%p endfor %}</w:t>
+      </w:r>
+    </w:p>
+    <w:p>
+      <w:r>
+        <w:t xml:space="preserve">{%p for b in sec.bullets %}</w:t>
+      </w:r>
+    </w:p>
+    <w:p>
+      <w:pPr>
+        <w:tabs>
+          <w:tab w:val="left" w:pos="320"/>
+        </w:tabs>
+        <w:spacing w:after="60" w:before="60" w:line="264"/>
+        <w:ind w:left="320" w:hanging="250"/>
+      </w:pPr>
+      <w:r>
+        <w:rPr>
+          <w:rFonts w:ascii="Calibri" w:cs="Calibri" w:eastAsia="Calibri" w:hAnsi="Calibri"/>
+          <w:b/>
+          <w:bCs/>
+          <w:color w:val="1E8A45"/>
+          <w:sz w:val="20"/>
+          <w:szCs w:val="20"/>
+        </w:rPr>
+        <w:t xml:space="preserve">•</w:t>
+      </w:r>
+      <w:r>
+        <w:rPr>
+          <w:rFonts w:ascii="Calibri" w:cs="Calibri" w:eastAsia="Calibri" w:hAnsi="Calibri"/>
+          <w:sz w:val="20"/>
+          <w:szCs w:val="20"/>
+        </w:rPr>
+        <w:tab/>
+      </w:r>
+      <w:r>
+        <w:rPr>
+          <w:rFonts w:ascii="Calibri" w:cs="Calibri" w:eastAsia="Calibri" w:hAnsi="Calibri"/>
+          <w:color w:val="2B2B2B"/>
+          <w:sz w:val="20"/>
+          <w:szCs w:val="20"/>
+        </w:rPr>
+        <w:t xml:space="preserve">{{ b }}</w:t>
+      </w:r>
+    </w:p>
+    <w:p>
+      <w:r>
+        <w:t xml:space="preserve">{%p endfor %}</w:t>
+      </w:r>
+    </w:p>
+    <w:p>
+      <w:r>
+        <w:t xml:space="preserve">{%p endfor %}</w:t>
+      </w:r>
+    </w:p>
+    <w:p>
+      <w:pPr>
+        <w:sectPr>
+          <w:headerReference w:type="default" r:id="rId12"/>
+          <w:footerReference w:type="default" r:id="rId13"/>
+          <w:pgSz w:w="12240" w:h="15840" w:orient="portrait"/>
+          <w:pgMar w:top="1100" w:right="1440" w:bottom="1100" w:left="1440" w:header="708" w:footer="708" w:gutter="0"/>
+          <w:pgNumType/>
+          <w:docGrid w:linePitch="360"/>
+        </w:sectPr>
+      </w:pPr>
+    </w:p>
+    <w:tbl>
+      <w:tblPr>
+        <w:tblW w:type="dxa" w:w="9360"/>
+        <w:tblBorders>
+          <w:top w:val="none"/>
+          <w:left w:val="none"/>
+          <w:bottom w:val="none"/>
+          <w:right w:val="none"/>
+          <w:insideH w:val="none"/>
+          <w:insideV w:val="none"/>
+        </w:tblBorders>
+      </w:tblPr>
+      <w:tblGrid>
+        <w:gridCol w:w="9360"/>
+      </w:tblGrid>
+      <w:tr>
+        <w:tc>
+          <w:tcPr>
+            <w:tcW w:type="dxa" w:w="9360"/>
+            <w:shd w:fill="1E8A45" w:val="clear"/>
+            <w:tcMar>
+              <w:top w:type="dxa" w:w="130"/>
+              <w:left w:type="dxa" w:w="200"/>
+              <w:bottom w:type="dxa" w:w="130"/>
+              <w:right w:type="dxa" w:w="200"/>
+            </w:tcMar>
+            <w:vAlign w:val="center"/>
+          </w:tcPr>
+          <w:p>
+            <w:pPr>
+              <w:spacing w:after="0" w:before="0"/>
+            </w:pPr>
+            <w:bookmarkStart w:name="sec_terms" w:id="104"/>
+            <w:r>
+              <w:rPr>
+                <w:rFonts w:ascii="Calibri" w:cs="Calibri" w:eastAsia="Calibri" w:hAnsi="Calibri"/>
+                <w:b/>
+                <w:bCs/>
+                <w:color w:val="FFFFFF"/>
+                <w:sz w:val="26"/>
+                <w:szCs w:val="26"/>
+              </w:rPr>
+              <w:t xml:space="preserve">{{ num_terms }}    </w:t>
             </w:r>
             <w:r>
               <w:rPr>

</xml_diff>

<commit_message>
Service Terms table: full borders + grey label column to match other tables
Co-Authored-By: Claude Opus 4.8 <noreply@anthropic.com>
</commit_message>
<xml_diff>
--- a/template/proposal_template.docx
+++ b/template/proposal_template.docx
@@ -2542,16 +2542,17 @@
           <w:tcPr>
             <w:tcW w:type="dxa" w:w="3000"/>
             <w:tcBorders>
-              <w:top w:val="none"/>
-              <w:left w:val="none"/>
+              <w:top w:val="single" w:color="D8DEDA" w:sz="2"/>
+              <w:left w:val="single" w:color="D8DEDA" w:sz="2"/>
               <w:bottom w:val="single" w:color="D8DEDA" w:sz="2"/>
-              <w:right w:val="none"/>
+              <w:right w:val="single" w:color="D8DEDA" w:sz="2"/>
             </w:tcBorders>
+            <w:shd w:fill="F4F6F5" w:val="clear"/>
             <w:tcMar>
               <w:top w:type="dxa" w:w="150"/>
-              <w:left w:type="dxa" w:w="0"/>
+              <w:left w:type="dxa" w:w="200"/>
               <w:bottom w:type="dxa" w:w="150"/>
-              <w:right w:type="dxa" w:w="200"/>
+              <w:right w:type="dxa" w:w="160"/>
             </w:tcMar>
             <w:vAlign w:val="top"/>
           </w:tcPr>
@@ -2576,16 +2577,16 @@
           <w:tcPr>
             <w:tcW w:type="dxa" w:w="6360"/>
             <w:tcBorders>
-              <w:top w:val="none"/>
-              <w:left w:val="none"/>
+              <w:top w:val="single" w:color="D8DEDA" w:sz="2"/>
+              <w:left w:val="single" w:color="D8DEDA" w:sz="2"/>
               <w:bottom w:val="single" w:color="D8DEDA" w:sz="2"/>
-              <w:right w:val="none"/>
+              <w:right w:val="single" w:color="D8DEDA" w:sz="2"/>
             </w:tcBorders>
             <w:tcMar>
               <w:top w:type="dxa" w:w="150"/>
               <w:left w:type="dxa" w:w="200"/>
               <w:bottom w:type="dxa" w:w="150"/>
-              <w:right w:type="dxa" w:w="0"/>
+              <w:right w:type="dxa" w:w="160"/>
             </w:tcMar>
             <w:vAlign w:val="top"/>
           </w:tcPr>

</xml_diff>

<commit_message>
Simplify scope for smaller quotes: remove area/rotation toggle + duration field; frequency-based presets (office/strata/medical/industrial)
Co-Authored-By: Claude Opus 4.8 <noreply@anthropic.com>
</commit_message>
<xml_diff>
--- a/template/proposal_template.docx
+++ b/template/proposal_template.docx
@@ -1005,24 +1005,17 @@
           <w:left w:val="none"/>
           <w:bottom w:val="none"/>
           <w:right w:val="none"/>
-          <w:insideH w:val="single" w:color="auto" w:sz="4"/>
-          <w:insideV w:val="single" w:color="auto" w:sz="4"/>
+          <w:insideH w:val="none"/>
+          <w:insideV w:val="none"/>
         </w:tblBorders>
       </w:tblPr>
       <w:tblGrid>
-        <w:gridCol w:w="4680"/>
-        <w:gridCol w:w="4680"/>
+        <w:gridCol w:w="9360"/>
       </w:tblGrid>
       <w:tr>
         <w:tc>
           <w:tcPr>
-            <w:tcW w:type="dxa" w:w="4680"/>
-            <w:tcBorders>
-              <w:top w:val="none"/>
-              <w:left w:val="none"/>
-              <w:bottom w:val="none"/>
-              <w:right w:val="single" w:color="FFFFFF" w:sz="8"/>
-            </w:tcBorders>
+            <w:tcW w:type="dxa" w:w="9360"/>
             <w:shd w:fill="EAF5EE" w:val="clear"/>
             <w:tcMar>
               <w:top w:type="dxa" w:w="160"/>
@@ -1060,55 +1053,6 @@
                 <w:szCs w:val="21"/>
               </w:rPr>
               <w:t xml:space="preserve">{{ frequency }}</w:t>
-            </w:r>
-          </w:p>
-        </w:tc>
-        <w:tc>
-          <w:tcPr>
-            <w:tcW w:type="dxa" w:w="4680"/>
-            <w:tcBorders>
-              <w:top w:val="none"/>
-              <w:left w:val="single" w:color="FFFFFF" w:sz="8"/>
-              <w:bottom w:val="none"/>
-              <w:right w:val="none"/>
-            </w:tcBorders>
-            <w:shd w:fill="EAF5EE" w:val="clear"/>
-            <w:tcMar>
-              <w:top w:type="dxa" w:w="160"/>
-              <w:left w:type="dxa" w:w="240"/>
-              <w:bottom w:type="dxa" w:w="160"/>
-              <w:right w:type="dxa" w:w="160"/>
-            </w:tcMar>
-          </w:tcPr>
-          <w:p>
-            <w:pPr>
-              <w:spacing w:after="0"/>
-            </w:pPr>
-            <w:r>
-              <w:rPr>
-                <w:rFonts w:ascii="Calibri" w:cs="Calibri" w:eastAsia="Calibri" w:hAnsi="Calibri"/>
-                <w:b/>
-                <w:bCs/>
-                <w:color w:val="166A35"/>
-                <w:spacing w:val="50"/>
-                <w:sz w:val="16"/>
-                <w:szCs w:val="16"/>
-              </w:rPr>
-              <w:t xml:space="preserve">DURATION</w:t>
-            </w:r>
-          </w:p>
-          <w:p>
-            <w:pPr>
-              <w:spacing w:after="0" w:before="30"/>
-            </w:pPr>
-            <w:r>
-              <w:rPr>
-                <w:rFonts w:ascii="Calibri" w:cs="Calibri" w:eastAsia="Calibri" w:hAnsi="Calibri"/>
-                <w:color w:val="2B2B2B"/>
-                <w:sz w:val="21"/>
-                <w:szCs w:val="21"/>
-              </w:rPr>
-              <w:t xml:space="preserve">{{ duration }}</w:t>
             </w:r>
           </w:p>
         </w:tc>

</xml_diff>

<commit_message>
Add client acceptance/signature block; auto GST calc (enter ex-GST, inc-GST computed); save/load draft (.json) to prevent data loss on refresh
Co-Authored-By: Claude Opus 4.8 <noreply@anthropic.com>
</commit_message>
<xml_diff>
--- a/template/proposal_template.docx
+++ b/template/proposal_template.docx
@@ -2666,6 +2666,299 @@
         </w:rPr>
         <w:t xml:space="preserve">Tel: 0422 337 452   |   hannah@acscommercialcleaning.com.au</w:t>
       </w:r>
+    </w:p>
+    <w:p>
+      <w:pPr>
+        <w:spacing w:after="120" w:before="320"/>
+      </w:pPr>
+      <w:r>
+        <w:rPr>
+          <w:rFonts w:ascii="Calibri" w:cs="Calibri" w:eastAsia="Calibri" w:hAnsi="Calibri"/>
+          <w:b/>
+          <w:bCs/>
+          <w:color w:val="1F3A2E"/>
+          <w:spacing w:val="30"/>
+          <w:sz w:val="24"/>
+          <w:szCs w:val="24"/>
+        </w:rPr>
+        <w:t xml:space="preserve">ACCEPTANCE</w:t>
+      </w:r>
+    </w:p>
+    <w:p>
+      <w:pPr>
+        <w:pBdr>
+          <w:bottom w:val="single" w:color="1E8A45" w:sz="14" w:space="1"/>
+        </w:pBdr>
+        <w:spacing w:after="220" w:before="0"/>
+      </w:pPr>
+    </w:p>
+    <w:p>
+      <w:pPr>
+        <w:spacing w:after="300" w:before="0" w:line="276"/>
+      </w:pPr>
+      <w:r>
+        <w:rPr>
+          <w:rFonts w:ascii="Calibri" w:cs="Calibri" w:eastAsia="Calibri" w:hAnsi="Calibri"/>
+          <w:color w:val="2B2B2B"/>
+          <w:sz w:val="21"/>
+          <w:szCs w:val="21"/>
+        </w:rPr>
+        <w:t xml:space="preserve">By signing below, </w:t>
+      </w:r>
+      <w:r>
+        <w:rPr>
+          <w:rFonts w:ascii="Calibri" w:cs="Calibri" w:eastAsia="Calibri" w:hAnsi="Calibri"/>
+          <w:b/>
+          <w:bCs/>
+          <w:color w:val="1F3A2E"/>
+          <w:sz w:val="21"/>
+          <w:szCs w:val="21"/>
+        </w:rPr>
+        <w:t xml:space="preserve">{{ client_name }}</w:t>
+      </w:r>
+      <w:r>
+        <w:rPr>
+          <w:rFonts w:ascii="Calibri" w:cs="Calibri" w:eastAsia="Calibri" w:hAnsi="Calibri"/>
+          <w:color w:val="2B2B2B"/>
+          <w:sz w:val="21"/>
+          <w:szCs w:val="21"/>
+        </w:rPr>
+        <w:t xml:space="preserve"> accepts this proposal and the service terms outlined above.</w:t>
+      </w:r>
+    </w:p>
+    <w:tbl>
+      <w:tblPr>
+        <w:tblW w:type="dxa" w:w="9360"/>
+        <w:tblBorders>
+          <w:top w:val="none"/>
+          <w:left w:val="none"/>
+          <w:bottom w:val="none"/>
+          <w:right w:val="none"/>
+          <w:insideH w:val="none"/>
+          <w:insideV w:val="none"/>
+        </w:tblBorders>
+      </w:tblPr>
+      <w:tblGrid>
+        <w:gridCol w:w="2600"/>
+        <w:gridCol w:w="6760"/>
+      </w:tblGrid>
+      <w:tr>
+        <w:trPr>
+          <w:trHeight w:val="520"/>
+        </w:trPr>
+        <w:tc>
+          <w:tcPr>
+            <w:tcW w:type="dxa" w:w="2600"/>
+            <w:tcMar>
+              <w:top w:type="dxa" w:w="80"/>
+              <w:left w:type="dxa" w:w="0"/>
+              <w:bottom w:type="dxa" w:w="40"/>
+              <w:right w:type="dxa" w:w="200"/>
+            </w:tcMar>
+            <w:vAlign w:val="bottom"/>
+          </w:tcPr>
+          <w:p>
+            <w:pPr>
+              <w:spacing w:after="0"/>
+            </w:pPr>
+            <w:r>
+              <w:rPr>
+                <w:rFonts w:ascii="Calibri" w:cs="Calibri" w:eastAsia="Calibri" w:hAnsi="Calibri"/>
+                <w:b/>
+                <w:bCs/>
+                <w:color w:val="166A35"/>
+                <w:sz w:val="21"/>
+                <w:szCs w:val="21"/>
+              </w:rPr>
+              <w:t xml:space="preserve">Accepted by (Name)</w:t>
+            </w:r>
+          </w:p>
+        </w:tc>
+        <w:tc>
+          <w:tcPr>
+            <w:tcW w:type="dxa" w:w="6760"/>
+            <w:tcBorders>
+              <w:bottom w:val="single" w:color="9AA3A0" w:sz="6"/>
+            </w:tcBorders>
+            <w:tcMar>
+              <w:top w:type="dxa" w:w="80"/>
+              <w:left w:type="dxa" w:w="40"/>
+              <w:bottom w:type="dxa" w:w="40"/>
+              <w:right w:type="dxa" w:w="0"/>
+            </w:tcMar>
+            <w:vAlign w:val="bottom"/>
+          </w:tcPr>
+          <w:p>
+            <w:pPr>
+              <w:spacing w:after="0"/>
+            </w:pPr>
+          </w:p>
+        </w:tc>
+      </w:tr>
+      <w:tr>
+        <w:trPr>
+          <w:trHeight w:val="520"/>
+        </w:trPr>
+        <w:tc>
+          <w:tcPr>
+            <w:tcW w:type="dxa" w:w="2600"/>
+            <w:tcMar>
+              <w:top w:type="dxa" w:w="80"/>
+              <w:left w:type="dxa" w:w="0"/>
+              <w:bottom w:type="dxa" w:w="40"/>
+              <w:right w:type="dxa" w:w="200"/>
+            </w:tcMar>
+            <w:vAlign w:val="bottom"/>
+          </w:tcPr>
+          <w:p>
+            <w:pPr>
+              <w:spacing w:after="0"/>
+            </w:pPr>
+            <w:r>
+              <w:rPr>
+                <w:rFonts w:ascii="Calibri" w:cs="Calibri" w:eastAsia="Calibri" w:hAnsi="Calibri"/>
+                <w:b/>
+                <w:bCs/>
+                <w:color w:val="166A35"/>
+                <w:sz w:val="21"/>
+                <w:szCs w:val="21"/>
+              </w:rPr>
+              <w:t xml:space="preserve">Position</w:t>
+            </w:r>
+          </w:p>
+        </w:tc>
+        <w:tc>
+          <w:tcPr>
+            <w:tcW w:type="dxa" w:w="6760"/>
+            <w:tcBorders>
+              <w:bottom w:val="single" w:color="9AA3A0" w:sz="6"/>
+            </w:tcBorders>
+            <w:tcMar>
+              <w:top w:type="dxa" w:w="80"/>
+              <w:left w:type="dxa" w:w="40"/>
+              <w:bottom w:type="dxa" w:w="40"/>
+              <w:right w:type="dxa" w:w="0"/>
+            </w:tcMar>
+            <w:vAlign w:val="bottom"/>
+          </w:tcPr>
+          <w:p>
+            <w:pPr>
+              <w:spacing w:after="0"/>
+            </w:pPr>
+          </w:p>
+        </w:tc>
+      </w:tr>
+      <w:tr>
+        <w:trPr>
+          <w:trHeight w:val="820"/>
+        </w:trPr>
+        <w:tc>
+          <w:tcPr>
+            <w:tcW w:type="dxa" w:w="2600"/>
+            <w:tcMar>
+              <w:top w:type="dxa" w:w="80"/>
+              <w:left w:type="dxa" w:w="0"/>
+              <w:bottom w:type="dxa" w:w="40"/>
+              <w:right w:type="dxa" w:w="200"/>
+            </w:tcMar>
+            <w:vAlign w:val="bottom"/>
+          </w:tcPr>
+          <w:p>
+            <w:pPr>
+              <w:spacing w:after="0"/>
+            </w:pPr>
+            <w:r>
+              <w:rPr>
+                <w:rFonts w:ascii="Calibri" w:cs="Calibri" w:eastAsia="Calibri" w:hAnsi="Calibri"/>
+                <w:b/>
+                <w:bCs/>
+                <w:color w:val="166A35"/>
+                <w:sz w:val="21"/>
+                <w:szCs w:val="21"/>
+              </w:rPr>
+              <w:t xml:space="preserve">Signature</w:t>
+            </w:r>
+          </w:p>
+        </w:tc>
+        <w:tc>
+          <w:tcPr>
+            <w:tcW w:type="dxa" w:w="6760"/>
+            <w:tcBorders>
+              <w:bottom w:val="single" w:color="9AA3A0" w:sz="6"/>
+            </w:tcBorders>
+            <w:tcMar>
+              <w:top w:type="dxa" w:w="80"/>
+              <w:left w:type="dxa" w:w="40"/>
+              <w:bottom w:type="dxa" w:w="40"/>
+              <w:right w:type="dxa" w:w="0"/>
+            </w:tcMar>
+            <w:vAlign w:val="bottom"/>
+          </w:tcPr>
+          <w:p>
+            <w:pPr>
+              <w:spacing w:after="0"/>
+            </w:pPr>
+          </w:p>
+        </w:tc>
+      </w:tr>
+      <w:tr>
+        <w:trPr>
+          <w:trHeight w:val="520"/>
+        </w:trPr>
+        <w:tc>
+          <w:tcPr>
+            <w:tcW w:type="dxa" w:w="2600"/>
+            <w:tcMar>
+              <w:top w:type="dxa" w:w="80"/>
+              <w:left w:type="dxa" w:w="0"/>
+              <w:bottom w:type="dxa" w:w="40"/>
+              <w:right w:type="dxa" w:w="200"/>
+            </w:tcMar>
+            <w:vAlign w:val="bottom"/>
+          </w:tcPr>
+          <w:p>
+            <w:pPr>
+              <w:spacing w:after="0"/>
+            </w:pPr>
+            <w:r>
+              <w:rPr>
+                <w:rFonts w:ascii="Calibri" w:cs="Calibri" w:eastAsia="Calibri" w:hAnsi="Calibri"/>
+                <w:b/>
+                <w:bCs/>
+                <w:color w:val="166A35"/>
+                <w:sz w:val="21"/>
+                <w:szCs w:val="21"/>
+              </w:rPr>
+              <w:t xml:space="preserve">Date</w:t>
+            </w:r>
+          </w:p>
+        </w:tc>
+        <w:tc>
+          <w:tcPr>
+            <w:tcW w:type="dxa" w:w="6760"/>
+            <w:tcBorders>
+              <w:bottom w:val="single" w:color="9AA3A0" w:sz="6"/>
+            </w:tcBorders>
+            <w:tcMar>
+              <w:top w:type="dxa" w:w="80"/>
+              <w:left w:type="dxa" w:w="40"/>
+              <w:bottom w:type="dxa" w:w="40"/>
+              <w:right w:type="dxa" w:w="0"/>
+            </w:tcMar>
+            <w:vAlign w:val="bottom"/>
+          </w:tcPr>
+          <w:p>
+            <w:pPr>
+              <w:spacing w:after="0"/>
+            </w:pPr>
+          </w:p>
+        </w:tc>
+      </w:tr>
+    </w:tbl>
+    <w:p>
+      <w:pPr>
+        <w:spacing w:after="0"/>
+      </w:pPr>
     </w:p>
     <w:sectPr>
       <w:headerReference w:type="default" r:id="rId14"/>

</xml_diff>

<commit_message>
Acceptance = its own numbered page with green section bar + TOC entry; add optional Testimonials / Client References / First Clean Guarantee sections; stronger 'What We Understood' wording
Co-Authored-By: Claude Opus 4.8 <noreply@anthropic.com>
</commit_message>
<xml_diff>
--- a/template/proposal_template.docx
+++ b/template/proposal_template.docx
@@ -2668,33 +2668,77 @@
       </w:r>
     </w:p>
     <w:p>
-      <w:pPr>
-        <w:spacing w:after="120" w:before="320"/>
-      </w:pPr>
-      <w:r>
-        <w:rPr>
-          <w:rFonts w:ascii="Calibri" w:cs="Calibri" w:eastAsia="Calibri" w:hAnsi="Calibri"/>
-          <w:b/>
-          <w:bCs/>
-          <w:color w:val="1F3A2E"/>
-          <w:spacing w:val="30"/>
-          <w:sz w:val="24"/>
-          <w:szCs w:val="24"/>
-        </w:rPr>
-        <w:t xml:space="preserve">ACCEPTANCE</w:t>
-      </w:r>
-    </w:p>
-    <w:p>
-      <w:pPr>
-        <w:pBdr>
-          <w:bottom w:val="single" w:color="1E8A45" w:sz="14" w:space="1"/>
-        </w:pBdr>
-        <w:spacing w:after="220" w:before="0"/>
-      </w:pPr>
-    </w:p>
-    <w:p>
-      <w:pPr>
-        <w:spacing w:after="300" w:before="0" w:line="276"/>
+      <w:r>
+        <w:br w:type="page"/>
+      </w:r>
+    </w:p>
+    <w:tbl>
+      <w:tblPr>
+        <w:tblW w:type="dxa" w:w="9360"/>
+        <w:tblBorders>
+          <w:top w:val="none"/>
+          <w:left w:val="none"/>
+          <w:bottom w:val="none"/>
+          <w:right w:val="none"/>
+          <w:insideH w:val="none"/>
+          <w:insideV w:val="none"/>
+        </w:tblBorders>
+      </w:tblPr>
+      <w:tblGrid>
+        <w:gridCol w:w="9360"/>
+      </w:tblGrid>
+      <w:tr>
+        <w:tc>
+          <w:tcPr>
+            <w:tcW w:type="dxa" w:w="9360"/>
+            <w:shd w:fill="1E8A45" w:val="clear"/>
+            <w:tcMar>
+              <w:top w:type="dxa" w:w="130"/>
+              <w:left w:type="dxa" w:w="200"/>
+              <w:bottom w:type="dxa" w:w="130"/>
+              <w:right w:type="dxa" w:w="200"/>
+            </w:tcMar>
+            <w:vAlign w:val="center"/>
+          </w:tcPr>
+          <w:p>
+            <w:pPr>
+              <w:spacing w:after="0" w:before="0"/>
+            </w:pPr>
+            <w:r>
+              <w:rPr>
+                <w:rFonts w:ascii="Calibri" w:cs="Calibri" w:eastAsia="Calibri" w:hAnsi="Calibri"/>
+                <w:b/>
+                <w:bCs/>
+                <w:color w:val="FFFFFF"/>
+                <w:sz w:val="26"/>
+                <w:szCs w:val="26"/>
+              </w:rPr>
+              <w:t xml:space="preserve">{{ num_acceptance }}    </w:t>
+            </w:r>
+            <w:r>
+              <w:rPr>
+                <w:rFonts w:ascii="Calibri" w:cs="Calibri" w:eastAsia="Calibri" w:hAnsi="Calibri"/>
+                <w:b/>
+                <w:bCs/>
+                <w:color w:val="FFFFFF"/>
+                <w:spacing w:val="20"/>
+                <w:sz w:val="26"/>
+                <w:szCs w:val="26"/>
+              </w:rPr>
+              <w:t xml:space="preserve">ACCEPTANCE</w:t>
+            </w:r>
+          </w:p>
+        </w:tc>
+      </w:tr>
+    </w:tbl>
+    <w:p>
+      <w:pPr>
+        <w:spacing w:after="300" w:before="0"/>
+      </w:pPr>
+    </w:p>
+    <w:p>
+      <w:pPr>
+        <w:spacing w:after="320" w:before="0" w:line="276"/>
       </w:pPr>
       <w:r>
         <w:rPr>

</xml_diff>

<commit_message>
Fix TOC overflow (tighter entries + compressed cover so many sections fit one page); render testimonials as styled quote boxes
Co-Authored-By: Claude Opus 4.8 <noreply@anthropic.com>
</commit_message>
<xml_diff>
--- a/template/proposal_template.docx
+++ b/template/proposal_template.docx
@@ -62,7 +62,7 @@
     </w:p>
     <w:p>
       <w:pPr>
-        <w:spacing w:after="560" w:before="0"/>
+        <w:spacing w:after="200" w:before="0"/>
       </w:pPr>
       <w:r>
         <w:rPr>
@@ -141,7 +141,7 @@
     </w:tbl>
     <w:p>
       <w:pPr>
-        <w:spacing w:after="620" w:before="0"/>
+        <w:spacing w:after="240" w:before="0"/>
       </w:pPr>
       <w:r>
         <w:rPr>
@@ -317,7 +317,7 @@
     </w:p>
     <w:p>
       <w:pPr>
-        <w:spacing w:after="560" w:before="0"/>
+        <w:spacing w:after="200" w:before="0"/>
       </w:pPr>
       <w:r>
         <w:rPr>
@@ -369,7 +369,7 @@
         <w:tabs>
           <w:tab w:val="right" w:pos="9360" w:leader="dot"/>
         </w:tabs>
-        <w:spacing w:after="180" w:before="0"/>
+        <w:spacing w:after="40" w:before="0"/>
       </w:pPr>
       <w:r>
         <w:rPr>
@@ -838,6 +838,80 @@
     </w:p>
     <w:p>
       <w:r>
+        <w:t xml:space="preserve">{%p if sec.kind == 'quote' %}</w:t>
+      </w:r>
+    </w:p>
+    <w:p>
+      <w:r>
+        <w:t xml:space="preserve">{%p for para in sec.paragraphs %}</w:t>
+      </w:r>
+    </w:p>
+    <w:tbl>
+      <w:tblPr>
+        <w:tblW w:type="dxa" w:w="9360"/>
+        <w:tblBorders>
+          <w:top w:val="none"/>
+          <w:left w:val="none"/>
+          <w:bottom w:val="none"/>
+          <w:right w:val="none"/>
+          <w:insideH w:val="none"/>
+          <w:insideV w:val="none"/>
+        </w:tblBorders>
+      </w:tblPr>
+      <w:tblGrid>
+        <w:gridCol w:w="9360"/>
+      </w:tblGrid>
+      <w:tr>
+        <w:tc>
+          <w:tcPr>
+            <w:tcW w:type="dxa" w:w="9360"/>
+            <w:tcBorders>
+              <w:left w:val="single" w:color="1E8A45" w:sz="24"/>
+            </w:tcBorders>
+            <w:shd w:fill="EAF5EE" w:val="clear"/>
+            <w:tcMar>
+              <w:top w:type="dxa" w:w="220"/>
+              <w:left w:type="dxa" w:w="300"/>
+              <w:bottom w:type="dxa" w:w="220"/>
+              <w:right w:type="dxa" w:w="260"/>
+            </w:tcMar>
+          </w:tcPr>
+          <w:p>
+            <w:pPr>
+              <w:spacing w:after="0" w:line="288"/>
+            </w:pPr>
+            <w:r>
+              <w:rPr>
+                <w:rFonts w:ascii="Calibri" w:cs="Calibri" w:eastAsia="Calibri" w:hAnsi="Calibri"/>
+                <w:i/>
+                <w:iCs/>
+                <w:color w:val="2B2B2B"/>
+                <w:sz w:val="22"/>
+                <w:szCs w:val="22"/>
+              </w:rPr>
+              <w:t xml:space="preserve">{{ para }}</w:t>
+            </w:r>
+          </w:p>
+        </w:tc>
+      </w:tr>
+    </w:tbl>
+    <w:p>
+      <w:pPr>
+        <w:spacing w:after="160" w:before="0"/>
+      </w:pPr>
+    </w:p>
+    <w:p>
+      <w:r>
+        <w:t xml:space="preserve">{%p endfor %}</w:t>
+      </w:r>
+    </w:p>
+    <w:p>
+      <w:r>
+        <w:t xml:space="preserve">{%p else %}</w:t>
+      </w:r>
+    </w:p>
+    <w:p>
+      <w:r>
         <w:t xml:space="preserve">{%p for para in sec.paragraphs %}</w:t>
       </w:r>
     </w:p>
@@ -858,6 +932,11 @@
     <w:p>
       <w:r>
         <w:t xml:space="preserve">{%p endfor %}</w:t>
+      </w:r>
+    </w:p>
+    <w:p>
+      <w:r>
+        <w:t xml:space="preserve">{%p endif %}</w:t>
       </w:r>
     </w:p>
     <w:p>
@@ -1484,6 +1563,80 @@
     </w:p>
     <w:p>
       <w:r>
+        <w:t xml:space="preserve">{%p if sec.kind == 'quote' %}</w:t>
+      </w:r>
+    </w:p>
+    <w:p>
+      <w:r>
+        <w:t xml:space="preserve">{%p for para in sec.paragraphs %}</w:t>
+      </w:r>
+    </w:p>
+    <w:tbl>
+      <w:tblPr>
+        <w:tblW w:type="dxa" w:w="9360"/>
+        <w:tblBorders>
+          <w:top w:val="none"/>
+          <w:left w:val="none"/>
+          <w:bottom w:val="none"/>
+          <w:right w:val="none"/>
+          <w:insideH w:val="none"/>
+          <w:insideV w:val="none"/>
+        </w:tblBorders>
+      </w:tblPr>
+      <w:tblGrid>
+        <w:gridCol w:w="9360"/>
+      </w:tblGrid>
+      <w:tr>
+        <w:tc>
+          <w:tcPr>
+            <w:tcW w:type="dxa" w:w="9360"/>
+            <w:tcBorders>
+              <w:left w:val="single" w:color="1E8A45" w:sz="24"/>
+            </w:tcBorders>
+            <w:shd w:fill="EAF5EE" w:val="clear"/>
+            <w:tcMar>
+              <w:top w:type="dxa" w:w="220"/>
+              <w:left w:type="dxa" w:w="300"/>
+              <w:bottom w:type="dxa" w:w="220"/>
+              <w:right w:type="dxa" w:w="260"/>
+            </w:tcMar>
+          </w:tcPr>
+          <w:p>
+            <w:pPr>
+              <w:spacing w:after="0" w:line="288"/>
+            </w:pPr>
+            <w:r>
+              <w:rPr>
+                <w:rFonts w:ascii="Calibri" w:cs="Calibri" w:eastAsia="Calibri" w:hAnsi="Calibri"/>
+                <w:i/>
+                <w:iCs/>
+                <w:color w:val="2B2B2B"/>
+                <w:sz w:val="22"/>
+                <w:szCs w:val="22"/>
+              </w:rPr>
+              <w:t xml:space="preserve">{{ para }}</w:t>
+            </w:r>
+          </w:p>
+        </w:tc>
+      </w:tr>
+    </w:tbl>
+    <w:p>
+      <w:pPr>
+        <w:spacing w:after="160" w:before="0"/>
+      </w:pPr>
+    </w:p>
+    <w:p>
+      <w:r>
+        <w:t xml:space="preserve">{%p endfor %}</w:t>
+      </w:r>
+    </w:p>
+    <w:p>
+      <w:r>
+        <w:t xml:space="preserve">{%p else %}</w:t>
+      </w:r>
+    </w:p>
+    <w:p>
+      <w:r>
         <w:t xml:space="preserve">{%p for para in sec.paragraphs %}</w:t>
       </w:r>
     </w:p>
@@ -1504,6 +1657,11 @@
     <w:p>
       <w:r>
         <w:t xml:space="preserve">{%p endfor %}</w:t>
+      </w:r>
+    </w:p>
+    <w:p>
+      <w:r>
+        <w:t xml:space="preserve">{%p endif %}</w:t>
       </w:r>
     </w:p>
     <w:p>
@@ -2271,6 +2429,80 @@
     </w:p>
     <w:p>
       <w:r>
+        <w:t xml:space="preserve">{%p if sec.kind == 'quote' %}</w:t>
+      </w:r>
+    </w:p>
+    <w:p>
+      <w:r>
+        <w:t xml:space="preserve">{%p for para in sec.paragraphs %}</w:t>
+      </w:r>
+    </w:p>
+    <w:tbl>
+      <w:tblPr>
+        <w:tblW w:type="dxa" w:w="9360"/>
+        <w:tblBorders>
+          <w:top w:val="none"/>
+          <w:left w:val="none"/>
+          <w:bottom w:val="none"/>
+          <w:right w:val="none"/>
+          <w:insideH w:val="none"/>
+          <w:insideV w:val="none"/>
+        </w:tblBorders>
+      </w:tblPr>
+      <w:tblGrid>
+        <w:gridCol w:w="9360"/>
+      </w:tblGrid>
+      <w:tr>
+        <w:tc>
+          <w:tcPr>
+            <w:tcW w:type="dxa" w:w="9360"/>
+            <w:tcBorders>
+              <w:left w:val="single" w:color="1E8A45" w:sz="24"/>
+            </w:tcBorders>
+            <w:shd w:fill="EAF5EE" w:val="clear"/>
+            <w:tcMar>
+              <w:top w:type="dxa" w:w="220"/>
+              <w:left w:type="dxa" w:w="300"/>
+              <w:bottom w:type="dxa" w:w="220"/>
+              <w:right w:type="dxa" w:w="260"/>
+            </w:tcMar>
+          </w:tcPr>
+          <w:p>
+            <w:pPr>
+              <w:spacing w:after="0" w:line="288"/>
+            </w:pPr>
+            <w:r>
+              <w:rPr>
+                <w:rFonts w:ascii="Calibri" w:cs="Calibri" w:eastAsia="Calibri" w:hAnsi="Calibri"/>
+                <w:i/>
+                <w:iCs/>
+                <w:color w:val="2B2B2B"/>
+                <w:sz w:val="22"/>
+                <w:szCs w:val="22"/>
+              </w:rPr>
+              <w:t xml:space="preserve">{{ para }}</w:t>
+            </w:r>
+          </w:p>
+        </w:tc>
+      </w:tr>
+    </w:tbl>
+    <w:p>
+      <w:pPr>
+        <w:spacing w:after="160" w:before="0"/>
+      </w:pPr>
+    </w:p>
+    <w:p>
+      <w:r>
+        <w:t xml:space="preserve">{%p endfor %}</w:t>
+      </w:r>
+    </w:p>
+    <w:p>
+      <w:r>
+        <w:t xml:space="preserve">{%p else %}</w:t>
+      </w:r>
+    </w:p>
+    <w:p>
+      <w:r>
         <w:t xml:space="preserve">{%p for para in sec.paragraphs %}</w:t>
       </w:r>
     </w:p>
@@ -2291,6 +2523,11 @@
     <w:p>
       <w:r>
         <w:t xml:space="preserve">{%p endfor %}</w:t>
+      </w:r>
+    </w:p>
+    <w:p>
+      <w:r>
+        <w:t xml:space="preserve">{%p endif %}</w:t>
       </w:r>
     </w:p>
     <w:p>
@@ -2566,7 +2803,7 @@
     </w:tbl>
     <w:p>
       <w:pPr>
-        <w:spacing w:after="560" w:before="0"/>
+        <w:spacing w:after="200" w:before="0"/>
       </w:pPr>
       <w:r>
         <w:rPr>

</xml_diff>

<commit_message>
Remove the Table of Contents (clean title page); merge Executive Summary + What We Understood into one Executive Summary section
Co-Authored-By: Claude Opus 4.8 <noreply@anthropic.com>
</commit_message>
<xml_diff>
--- a/template/proposal_template.docx
+++ b/template/proposal_template.docx
@@ -62,7 +62,7 @@
     </w:p>
     <w:p>
       <w:pPr>
-        <w:spacing w:after="200" w:before="0"/>
+        <w:spacing w:after="560" w:before="0"/>
       </w:pPr>
       <w:r>
         <w:rPr>
@@ -141,7 +141,7 @@
     </w:tbl>
     <w:p>
       <w:pPr>
-        <w:spacing w:after="240" w:before="0"/>
+        <w:spacing w:after="620" w:before="0"/>
       </w:pPr>
       <w:r>
         <w:rPr>
@@ -317,7 +317,7 @@
     </w:p>
     <w:p>
       <w:pPr>
-        <w:spacing w:after="200" w:before="0"/>
+        <w:spacing w:after="560" w:before="0"/>
       </w:pPr>
       <w:r>
         <w:rPr>
@@ -325,76 +325,6 @@
           <w:szCs w:val="2"/>
         </w:rPr>
         <w:t xml:space="preserve"/>
-      </w:r>
-    </w:p>
-    <w:p>
-      <w:pPr>
-        <w:spacing w:after="0" w:before="0"/>
-      </w:pPr>
-      <w:r>
-        <w:rPr>
-          <w:rFonts w:ascii="Calibri" w:cs="Calibri" w:eastAsia="Calibri" w:hAnsi="Calibri"/>
-          <w:b/>
-          <w:bCs/>
-          <w:color w:val="1F3A2E"/>
-          <w:spacing w:val="40"/>
-          <w:sz w:val="22"/>
-          <w:szCs w:val="22"/>
-        </w:rPr>
-        <w:t xml:space="preserve">TABLE OF CONTENTS</w:t>
-      </w:r>
-    </w:p>
-    <w:p>
-      <w:pPr>
-        <w:pBdr>
-          <w:bottom w:val="single" w:color="1E8A45" w:sz="14" w:space="1"/>
-        </w:pBdr>
-        <w:spacing w:after="320" w:before="160"/>
-      </w:pPr>
-      <w:r>
-        <w:rPr>
-          <w:sz w:val="2"/>
-          <w:szCs w:val="2"/>
-        </w:rPr>
-        <w:t xml:space="preserve"/>
-      </w:r>
-    </w:p>
-    <w:p>
-      <w:r>
-        <w:t xml:space="preserve">{%p for item in toc %}</w:t>
-      </w:r>
-    </w:p>
-    <w:p>
-      <w:pPr>
-        <w:tabs>
-          <w:tab w:val="right" w:pos="9360" w:leader="dot"/>
-        </w:tabs>
-        <w:spacing w:after="40" w:before="0"/>
-      </w:pPr>
-      <w:r>
-        <w:rPr>
-          <w:rFonts w:ascii="Calibri" w:cs="Calibri" w:eastAsia="Calibri" w:hAnsi="Calibri"/>
-          <w:b/>
-          <w:bCs/>
-          <w:color w:val="1E8A45"/>
-          <w:sz w:val="22"/>
-          <w:szCs w:val="22"/>
-        </w:rPr>
-        <w:t xml:space="preserve">{{ item.num }}</w:t>
-      </w:r>
-      <w:r>
-        <w:rPr>
-          <w:rFonts w:ascii="Calibri" w:cs="Calibri" w:eastAsia="Calibri" w:hAnsi="Calibri"/>
-          <w:color w:val="1F3A2E"/>
-          <w:sz w:val="22"/>
-          <w:szCs w:val="22"/>
-        </w:rPr>
-        <w:t xml:space="preserve">       {{ item.title }}</w:t>
-      </w:r>
-    </w:p>
-    <w:p>
-      <w:r>
-        <w:t xml:space="preserve">{%p endfor %}</w:t>
       </w:r>
     </w:p>
     <w:p>
@@ -2803,7 +2733,7 @@
     </w:tbl>
     <w:p>
       <w:pPr>
-        <w:spacing w:after="200" w:before="0"/>
+        <w:spacing w:after="560" w:before="0"/>
       </w:pPr>
       <w:r>
         <w:rPr>

</xml_diff>

<commit_message>
Update logo to corrected ACS Commercial Cleaning artwork (fix 'COMMERCIAL' spelling); set cover image height to match the 3:1 logo so it isn't stretched
Co-Authored-By: Claude Opus 4.8 <noreply@anthropic.com>
</commit_message>
<xml_diff>
--- a/template/proposal_template.docx
+++ b/template/proposal_template.docx
@@ -22,7 +22,7 @@
       <w:r>
         <w:drawing>
           <wp:inline distT="0" distB="0" distL="0" distR="0">
-            <wp:extent cx="2857500" cy="1295400"/>
+            <wp:extent cx="2857500" cy="952500"/>
             <wp:effectExtent t="0" r="0" b="0" l="0"/>
             <wp:docPr id="1" name="ACSLogo" descr="ACS Commercial Cleaning company logo" title="ACS Commercial Cleaning logo"/>
             <wp:cNvGraphicFramePr>
@@ -47,7 +47,7 @@
                   <pic:spPr bwMode="auto">
                     <a:xfrm>
                       <a:off x="0" y="0"/>
-                      <a:ext cx="2857500" cy="1295400"/>
+                      <a:ext cx="2857500" cy="952500"/>
                     </a:xfrm>
                     <a:prstGeom prst="rect">
                       <a:avLst/>

</xml_diff>

<commit_message>
Add optional HIA client testimonial section: typeset (not a screenshot) in a branded panel, with Meg Diola sign-off and the HIA logo as a real embedded image; toggled via an app checkbox
Co-Authored-By: Claude Opus 4.8 <noreply@anthropic.com>
</commit_message>
<xml_diff>
--- a/template/proposal_template.docx
+++ b/template/proposal_template.docx
@@ -2510,6 +2510,291 @@
     <w:p>
       <w:r>
         <w:t xml:space="preserve">{%p endfor %}</w:t>
+      </w:r>
+    </w:p>
+    <w:p>
+      <w:r>
+        <w:t xml:space="preserve">{%p if include_testimonial %}</w:t>
+      </w:r>
+    </w:p>
+    <w:p>
+      <w:r>
+        <w:br w:type="page"/>
+      </w:r>
+    </w:p>
+    <w:tbl>
+      <w:tblPr>
+        <w:tblW w:type="dxa" w:w="9360"/>
+        <w:tblBorders>
+          <w:top w:val="none"/>
+          <w:left w:val="none"/>
+          <w:bottom w:val="none"/>
+          <w:right w:val="none"/>
+          <w:insideH w:val="none"/>
+          <w:insideV w:val="none"/>
+        </w:tblBorders>
+      </w:tblPr>
+      <w:tblGrid>
+        <w:gridCol w:w="9360"/>
+      </w:tblGrid>
+      <w:tr>
+        <w:tc>
+          <w:tcPr>
+            <w:tcW w:type="dxa" w:w="9360"/>
+            <w:shd w:fill="1E8A45" w:val="clear"/>
+            <w:tcMar>
+              <w:top w:type="dxa" w:w="130"/>
+              <w:left w:type="dxa" w:w="200"/>
+              <w:bottom w:type="dxa" w:w="130"/>
+              <w:right w:type="dxa" w:w="200"/>
+            </w:tcMar>
+            <w:vAlign w:val="center"/>
+          </w:tcPr>
+          <w:p>
+            <w:pPr>
+              <w:spacing w:after="0" w:before="0"/>
+            </w:pPr>
+            <w:r>
+              <w:rPr>
+                <w:rFonts w:ascii="Calibri" w:cs="Calibri" w:eastAsia="Calibri" w:hAnsi="Calibri"/>
+                <w:b/>
+                <w:bCs/>
+                <w:color w:val="FFFFFF"/>
+                <w:sz w:val="26"/>
+                <w:szCs w:val="26"/>
+              </w:rPr>
+              <w:t xml:space="preserve">{{ num_testimonial }}    </w:t>
+            </w:r>
+            <w:r>
+              <w:rPr>
+                <w:rFonts w:ascii="Calibri" w:cs="Calibri" w:eastAsia="Calibri" w:hAnsi="Calibri"/>
+                <w:b/>
+                <w:bCs/>
+                <w:color w:val="FFFFFF"/>
+                <w:spacing w:val="20"/>
+                <w:sz w:val="26"/>
+                <w:szCs w:val="26"/>
+              </w:rPr>
+              <w:t xml:space="preserve">TESTIMONIAL</w:t>
+            </w:r>
+          </w:p>
+        </w:tc>
+      </w:tr>
+    </w:tbl>
+    <w:p>
+      <w:pPr>
+        <w:spacing w:after="280" w:before="0"/>
+      </w:pPr>
+    </w:p>
+    <w:tbl>
+      <w:tblPr>
+        <w:tblW w:type="dxa" w:w="9360"/>
+        <w:tblBorders>
+          <w:top w:val="none"/>
+          <w:left w:val="none"/>
+          <w:bottom w:val="none"/>
+          <w:right w:val="none"/>
+          <w:insideH w:val="none"/>
+          <w:insideV w:val="none"/>
+        </w:tblBorders>
+      </w:tblPr>
+      <w:tblGrid>
+        <w:gridCol w:w="9360"/>
+      </w:tblGrid>
+      <w:tr>
+        <w:tc>
+          <w:tcPr>
+            <w:tcW w:type="dxa" w:w="9360"/>
+            <w:tcBorders>
+              <w:left w:val="single" w:color="1E8A45" w:sz="24"/>
+            </w:tcBorders>
+            <w:shd w:fill="EAF5EE" w:val="clear"/>
+            <w:tcMar>
+              <w:top w:type="dxa" w:w="260"/>
+              <w:left w:type="dxa" w:w="320"/>
+              <w:bottom w:type="dxa" w:w="260"/>
+              <w:right w:type="dxa" w:w="320"/>
+            </w:tcMar>
+          </w:tcPr>
+          <w:p>
+            <w:pPr>
+              <w:spacing w:after="150" w:before="0" w:line="276"/>
+            </w:pPr>
+            <w:r>
+              <w:rPr>
+                <w:rFonts w:ascii="Calibri" w:cs="Calibri" w:eastAsia="Calibri" w:hAnsi="Calibri"/>
+                <w:color w:val="2B2B2B"/>
+                <w:sz w:val="21"/>
+                <w:szCs w:val="21"/>
+              </w:rPr>
+              <w:t xml:space="preserve">Prior to relocating to Burnley, the Housing Industry Association (HIA) was based in Jolimont. After many years of searching for a reliable cleaning provider, I was fortunate to discover ACS Commercial Cleaning back in 2018. Hannah, the Operator and Director, is exceptionally professional and easy to work with, and her team consistently delivers outstanding service.</w:t>
+            </w:r>
+          </w:p>
+          <w:p>
+            <w:pPr>
+              <w:spacing w:after="150" w:before="0" w:line="276"/>
+            </w:pPr>
+            <w:r>
+              <w:rPr>
+                <w:rFonts w:ascii="Calibri" w:cs="Calibri" w:eastAsia="Calibri" w:hAnsi="Calibri"/>
+                <w:color w:val="2B2B2B"/>
+                <w:sz w:val="21"/>
+                <w:szCs w:val="21"/>
+              </w:rPr>
+              <w:t xml:space="preserve">When HIA moved to a leased office in the Botanicca precinct in Burnley in 2023, we were required to use the incumbent cleaning contractors as part of our rental agreement. Over the two years we were there, I had to raise multiple concerns directly with their Director and staff regarding the substandard cleaning. Common issues included crumbs left in the kitchen, missed rubbish removal, and poor vacuuming. On several occasions, I stayed back late due to work commitments and observed that only the bare minimum was being done. These problems were persistent and frustrating.</w:t>
+            </w:r>
+          </w:p>
+          <w:p>
+            <w:pPr>
+              <w:spacing w:after="150" w:before="0" w:line="276"/>
+            </w:pPr>
+            <w:r>
+              <w:rPr>
+                <w:rFonts w:ascii="Calibri" w:cs="Calibri" w:eastAsia="Calibri" w:hAnsi="Calibri"/>
+                <w:color w:val="2B2B2B"/>
+                <w:sz w:val="21"/>
+                <w:szCs w:val="21"/>
+              </w:rPr>
+              <w:t xml:space="preserve">Now that HIA has settled into its permanent home in Cremorne, we are once again partnering with ACS Commercial Cleaning, and what a relief it has been. Their team is flexible and happy to accommodate any unscheduled cleaning requests. Hannah and her staff are a pleasure to deal with, and the quality of cleaning is consistently exceptional.</w:t>
+            </w:r>
+          </w:p>
+          <w:p>
+            <w:pPr>
+              <w:spacing w:after="150" w:before="0" w:line="276"/>
+            </w:pPr>
+            <w:r>
+              <w:rPr>
+                <w:rFonts w:ascii="Calibri" w:cs="Calibri" w:eastAsia="Calibri" w:hAnsi="Calibri"/>
+                <w:color w:val="2B2B2B"/>
+                <w:sz w:val="21"/>
+                <w:szCs w:val="21"/>
+              </w:rPr>
+              <w:t xml:space="preserve">ACS also collaborates with Altid Group for external window cleaning, another highly professional company. Together, they offer a comprehensive solution for all our cleaning needs. Staff have even commented on the pleasant scent of the cleaning products used, which are effective without being harsh.</w:t>
+            </w:r>
+          </w:p>
+          <w:p>
+            <w:pPr>
+              <w:spacing w:after="0" w:before="0" w:line="276"/>
+            </w:pPr>
+            <w:r>
+              <w:rPr>
+                <w:rFonts w:ascii="Calibri" w:cs="Calibri" w:eastAsia="Calibri" w:hAnsi="Calibri"/>
+                <w:color w:val="2B2B2B"/>
+                <w:sz w:val="21"/>
+                <w:szCs w:val="21"/>
+              </w:rPr>
+              <w:t xml:space="preserve">For any organisation seeking reliable, high-quality cleaning services, whether commercial or residential, I wholeheartedly recommend ACS Commercial Cleaning. They truly set the standard in the industry.</w:t>
+            </w:r>
+          </w:p>
+        </w:tc>
+      </w:tr>
+    </w:tbl>
+    <w:p>
+      <w:pPr>
+        <w:spacing w:after="280" w:before="0"/>
+      </w:pPr>
+    </w:p>
+    <w:tbl>
+      <w:tblPr>
+        <w:tblW w:type="dxa" w:w="9360"/>
+        <w:tblBorders>
+          <w:top w:val="none"/>
+          <w:left w:val="none"/>
+          <w:bottom w:val="none"/>
+          <w:right w:val="none"/>
+          <w:insideH w:val="none"/>
+          <w:insideV w:val="none"/>
+        </w:tblBorders>
+      </w:tblPr>
+      <w:tblGrid>
+        <w:gridCol w:w="6360"/>
+        <w:gridCol w:w="3000"/>
+      </w:tblGrid>
+      <w:tr>
+        <w:tc>
+          <w:tcPr>
+            <w:tcW w:type="dxa" w:w="6360"/>
+            <w:vAlign w:val="center"/>
+          </w:tcPr>
+          <w:p>
+            <w:pPr>
+              <w:spacing w:after="80" w:before="0"/>
+            </w:pPr>
+            <w:r>
+              <w:rPr>
+                <w:rFonts w:ascii="Calibri" w:cs="Calibri" w:eastAsia="Calibri" w:hAnsi="Calibri"/>
+                <w:color w:val="2B2B2B"/>
+                <w:sz w:val="21"/>
+                <w:szCs w:val="21"/>
+              </w:rPr>
+              <w:t xml:space="preserve">Kind regards,</w:t>
+            </w:r>
+          </w:p>
+          <w:p>
+            <w:pPr>
+              <w:spacing w:after="0" w:before="0"/>
+            </w:pPr>
+            <w:r>
+              <w:rPr>
+                <w:rFonts w:ascii="Calibri" w:cs="Calibri" w:eastAsia="Calibri" w:hAnsi="Calibri"/>
+                <w:b/>
+                <w:bCs/>
+                <w:color w:val="1F3A2E"/>
+                <w:sz w:val="23"/>
+                <w:szCs w:val="23"/>
+              </w:rPr>
+              <w:t xml:space="preserve">Meg Diola</w:t>
+            </w:r>
+          </w:p>
+          <w:p>
+            <w:pPr>
+              <w:spacing w:after="0" w:before="0"/>
+            </w:pPr>
+            <w:r>
+              <w:rPr>
+                <w:rFonts w:ascii="Calibri" w:cs="Calibri" w:eastAsia="Calibri" w:hAnsi="Calibri"/>
+                <w:color w:val="6B7280"/>
+                <w:sz w:val="20"/>
+                <w:szCs w:val="20"/>
+              </w:rPr>
+              <w:t xml:space="preserve">Vic Office Manager</w:t>
+            </w:r>
+          </w:p>
+          <w:p>
+            <w:pPr>
+              <w:spacing w:after="0" w:before="0"/>
+            </w:pPr>
+            <w:r>
+              <w:rPr>
+                <w:rFonts w:ascii="Calibri" w:cs="Calibri" w:eastAsia="Calibri" w:hAnsi="Calibri"/>
+                <w:color w:val="6B7280"/>
+                <w:sz w:val="20"/>
+                <w:szCs w:val="20"/>
+              </w:rPr>
+              <w:t xml:space="preserve">Housing Industry Association Ltd</w:t>
+            </w:r>
+          </w:p>
+        </w:tc>
+        <w:tc>
+          <w:tcPr>
+            <w:tcW w:type="dxa" w:w="3000"/>
+            <w:vAlign w:val="center"/>
+          </w:tcPr>
+          <w:p>
+            <w:pPr>
+              <w:spacing w:after="0" w:before="0"/>
+              <w:jc w:val="right"/>
+            </w:pPr>
+            <w:r>
+              <w:t xml:space="preserve">{{ hia_logo }}</w:t>
+            </w:r>
+          </w:p>
+        </w:tc>
+      </w:tr>
+    </w:tbl>
+    <w:p>
+      <w:r>
+        <w:t xml:space="preserve">{%p endif %}</w:t>
       </w:r>
     </w:p>
     <w:p>

</xml_diff>

<commit_message>
Add optional Compliance Documents section: branded divider page listing the 3 certificates, with the actual Labour Hire Licence / WorkCover / Public Liability PDFs auto-stitched into the PDF right after the divider (pypdf); toggled via an app checkbox
Co-Authored-By: Claude Opus 4.8 <noreply@anthropic.com>
</commit_message>
<xml_diff>
--- a/template/proposal_template.docx
+++ b/template/proposal_template.docx
@@ -2792,6 +2792,232 @@
         </w:tc>
       </w:tr>
     </w:tbl>
+    <w:p>
+      <w:r>
+        <w:t xml:space="preserve">{%p endif %}</w:t>
+      </w:r>
+    </w:p>
+    <w:p>
+      <w:r>
+        <w:t xml:space="preserve">{%p if include_compliance %}</w:t>
+      </w:r>
+    </w:p>
+    <w:p>
+      <w:r>
+        <w:br w:type="page"/>
+      </w:r>
+    </w:p>
+    <w:tbl>
+      <w:tblPr>
+        <w:tblW w:type="dxa" w:w="9360"/>
+        <w:tblBorders>
+          <w:top w:val="none"/>
+          <w:left w:val="none"/>
+          <w:bottom w:val="none"/>
+          <w:right w:val="none"/>
+          <w:insideH w:val="none"/>
+          <w:insideV w:val="none"/>
+        </w:tblBorders>
+      </w:tblPr>
+      <w:tblGrid>
+        <w:gridCol w:w="9360"/>
+      </w:tblGrid>
+      <w:tr>
+        <w:tc>
+          <w:tcPr>
+            <w:tcW w:type="dxa" w:w="9360"/>
+            <w:shd w:fill="1E8A45" w:val="clear"/>
+            <w:tcMar>
+              <w:top w:type="dxa" w:w="130"/>
+              <w:left w:type="dxa" w:w="200"/>
+              <w:bottom w:type="dxa" w:w="130"/>
+              <w:right w:type="dxa" w:w="200"/>
+            </w:tcMar>
+            <w:vAlign w:val="center"/>
+          </w:tcPr>
+          <w:p>
+            <w:pPr>
+              <w:spacing w:after="0" w:before="0"/>
+            </w:pPr>
+            <w:r>
+              <w:rPr>
+                <w:rFonts w:ascii="Calibri" w:cs="Calibri" w:eastAsia="Calibri" w:hAnsi="Calibri"/>
+                <w:b/>
+                <w:bCs/>
+                <w:color w:val="FFFFFF"/>
+                <w:sz w:val="26"/>
+                <w:szCs w:val="26"/>
+              </w:rPr>
+              <w:t xml:space="preserve">{{ num_compliance }}    </w:t>
+            </w:r>
+            <w:r>
+              <w:rPr>
+                <w:rFonts w:ascii="Calibri" w:cs="Calibri" w:eastAsia="Calibri" w:hAnsi="Calibri"/>
+                <w:b/>
+                <w:bCs/>
+                <w:color w:val="FFFFFF"/>
+                <w:spacing w:val="20"/>
+                <w:sz w:val="26"/>
+                <w:szCs w:val="26"/>
+              </w:rPr>
+              <w:t xml:space="preserve">COMPLIANCE DOCUMENTS</w:t>
+            </w:r>
+          </w:p>
+        </w:tc>
+      </w:tr>
+    </w:tbl>
+    <w:p>
+      <w:pPr>
+        <w:spacing w:after="280" w:before="0"/>
+      </w:pPr>
+    </w:p>
+    <w:p>
+      <w:pPr>
+        <w:spacing w:after="200" w:before="0" w:line="276"/>
+      </w:pPr>
+      <w:r>
+        <w:rPr>
+          <w:rFonts w:ascii="Calibri" w:cs="Calibri" w:eastAsia="Calibri" w:hAnsi="Calibri"/>
+          <w:color w:val="2B2B2B"/>
+          <w:sz w:val="21"/>
+          <w:szCs w:val="21"/>
+        </w:rPr>
+        <w:t xml:space="preserve">ACS Commercial Cleaning holds current licensing and insurance for all work undertaken. Copies of the following documents are attached to this proposal:</w:t>
+      </w:r>
+    </w:p>
+    <w:p>
+      <w:pPr>
+        <w:tabs>
+          <w:tab w:val="left" w:pos="360"/>
+        </w:tabs>
+        <w:spacing w:after="120" w:before="120" w:line="264"/>
+        <w:ind w:left="360" w:hanging="360"/>
+      </w:pPr>
+      <w:r>
+        <w:rPr>
+          <w:rFonts w:ascii="Calibri" w:cs="Calibri" w:eastAsia="Calibri" w:hAnsi="Calibri"/>
+          <w:b/>
+          <w:bCs/>
+          <w:color w:val="1E8A45"/>
+          <w:sz w:val="24"/>
+          <w:szCs w:val="24"/>
+        </w:rPr>
+        <w:t xml:space="preserve">✓</w:t>
+      </w:r>
+      <w:r>
+        <w:rPr>
+          <w:rFonts w:ascii="Calibri" w:cs="Calibri" w:eastAsia="Calibri" w:hAnsi="Calibri"/>
+          <w:sz w:val="22"/>
+          <w:szCs w:val="22"/>
+        </w:rPr>
+        <w:tab/>
+      </w:r>
+      <w:r>
+        <w:rPr>
+          <w:rFonts w:ascii="Calibri" w:cs="Calibri" w:eastAsia="Calibri" w:hAnsi="Calibri"/>
+          <w:b/>
+          <w:bCs/>
+          <w:color w:val="2B2B2B"/>
+          <w:sz w:val="22"/>
+          <w:szCs w:val="22"/>
+        </w:rPr>
+        <w:t xml:space="preserve">Labour Hire Licence</w:t>
+      </w:r>
+    </w:p>
+    <w:p>
+      <w:pPr>
+        <w:tabs>
+          <w:tab w:val="left" w:pos="360"/>
+        </w:tabs>
+        <w:spacing w:after="120" w:before="120" w:line="264"/>
+        <w:ind w:left="360" w:hanging="360"/>
+      </w:pPr>
+      <w:r>
+        <w:rPr>
+          <w:rFonts w:ascii="Calibri" w:cs="Calibri" w:eastAsia="Calibri" w:hAnsi="Calibri"/>
+          <w:b/>
+          <w:bCs/>
+          <w:color w:val="1E8A45"/>
+          <w:sz w:val="24"/>
+          <w:szCs w:val="24"/>
+        </w:rPr>
+        <w:t xml:space="preserve">✓</w:t>
+      </w:r>
+      <w:r>
+        <w:rPr>
+          <w:rFonts w:ascii="Calibri" w:cs="Calibri" w:eastAsia="Calibri" w:hAnsi="Calibri"/>
+          <w:sz w:val="22"/>
+          <w:szCs w:val="22"/>
+        </w:rPr>
+        <w:tab/>
+      </w:r>
+      <w:r>
+        <w:rPr>
+          <w:rFonts w:ascii="Calibri" w:cs="Calibri" w:eastAsia="Calibri" w:hAnsi="Calibri"/>
+          <w:b/>
+          <w:bCs/>
+          <w:color w:val="2B2B2B"/>
+          <w:sz w:val="22"/>
+          <w:szCs w:val="22"/>
+        </w:rPr>
+        <w:t xml:space="preserve">WorkCover Insurance — Certificate of Currency</w:t>
+      </w:r>
+    </w:p>
+    <w:p>
+      <w:pPr>
+        <w:tabs>
+          <w:tab w:val="left" w:pos="360"/>
+        </w:tabs>
+        <w:spacing w:after="120" w:before="120" w:line="264"/>
+        <w:ind w:left="360" w:hanging="360"/>
+      </w:pPr>
+      <w:r>
+        <w:rPr>
+          <w:rFonts w:ascii="Calibri" w:cs="Calibri" w:eastAsia="Calibri" w:hAnsi="Calibri"/>
+          <w:b/>
+          <w:bCs/>
+          <w:color w:val="1E8A45"/>
+          <w:sz w:val="24"/>
+          <w:szCs w:val="24"/>
+        </w:rPr>
+        <w:t xml:space="preserve">✓</w:t>
+      </w:r>
+      <w:r>
+        <w:rPr>
+          <w:rFonts w:ascii="Calibri" w:cs="Calibri" w:eastAsia="Calibri" w:hAnsi="Calibri"/>
+          <w:sz w:val="22"/>
+          <w:szCs w:val="22"/>
+        </w:rPr>
+        <w:tab/>
+      </w:r>
+      <w:r>
+        <w:rPr>
+          <w:rFonts w:ascii="Calibri" w:cs="Calibri" w:eastAsia="Calibri" w:hAnsi="Calibri"/>
+          <w:b/>
+          <w:bCs/>
+          <w:color w:val="2B2B2B"/>
+          <w:sz w:val="22"/>
+          <w:szCs w:val="22"/>
+        </w:rPr>
+        <w:t xml:space="preserve">Public Liability Insurance — Certificate of Currency</w:t>
+      </w:r>
+    </w:p>
+    <w:p>
+      <w:pPr>
+        <w:spacing w:after="0" w:before="120" w:line="276"/>
+      </w:pPr>
+      <w:r>
+        <w:rPr>
+          <w:rFonts w:ascii="Calibri" w:cs="Calibri" w:eastAsia="Calibri" w:hAnsi="Calibri"/>
+          <w:i/>
+          <w:iCs/>
+          <w:color w:val="6B7280"/>
+          <w:sz w:val="20"/>
+          <w:szCs w:val="20"/>
+        </w:rPr>
+        <w:t xml:space="preserve">Full copies of each document are included on the following pages.</w:t>
+      </w:r>
+    </w:p>
     <w:p>
       <w:r>
         <w:t xml:space="preserve">{%p endif %}</w:t>

</xml_diff>

<commit_message>
Embed compliance certificates inside the document as full-page images (each on its own page) instead of appending separate PDFs — so every cert page carries the ACS header, footer and continuous page numbering; remove pypdf
Co-Authored-By: Claude Opus 4.8 <noreply@anthropic.com>
</commit_message>
<xml_diff>
--- a/template/proposal_template.docx
+++ b/template/proposal_template.docx
@@ -3016,6 +3016,48 @@
           <w:szCs w:val="20"/>
         </w:rPr>
         <w:t xml:space="preserve">Full copies of each document are included on the following pages.</w:t>
+      </w:r>
+    </w:p>
+    <w:p>
+      <w:r>
+        <w:br w:type="page"/>
+      </w:r>
+    </w:p>
+    <w:p>
+      <w:pPr>
+        <w:spacing w:after="0" w:before="0"/>
+        <w:jc w:val="center"/>
+      </w:pPr>
+      <w:r>
+        <w:t xml:space="preserve">{{ cert_labour }}</w:t>
+      </w:r>
+    </w:p>
+    <w:p>
+      <w:r>
+        <w:br w:type="page"/>
+      </w:r>
+    </w:p>
+    <w:p>
+      <w:pPr>
+        <w:spacing w:after="0" w:before="0"/>
+        <w:jc w:val="center"/>
+      </w:pPr>
+      <w:r>
+        <w:t xml:space="preserve">{{ cert_workcover }}</w:t>
+      </w:r>
+    </w:p>
+    <w:p>
+      <w:r>
+        <w:br w:type="page"/>
+      </w:r>
+    </w:p>
+    <w:p>
+      <w:pPr>
+        <w:spacing w:after="0" w:before="0"/>
+        <w:jc w:val="center"/>
+      </w:pPr>
+      <w:r>
+        <w:t xml:space="preserve">{{ cert_public }}</w:t>
       </w:r>
     </w:p>
     <w:p>

</xml_diff>

<commit_message>
Make the HIA testimonial easier to read (opening quote mark, more paragraph spacing + line height) and bold the strongest line ('we are once again partnering with ACS... what a relief it has been')
Co-Authored-By: Claude Opus 4.8 <noreply@anthropic.com>
</commit_message>
<xml_diff>
--- a/template/proposal_template.docx
+++ b/template/proposal_template.docx
@@ -2610,15 +2610,31 @@
             </w:tcBorders>
             <w:shd w:fill="EAF5EE" w:val="clear"/>
             <w:tcMar>
-              <w:top w:type="dxa" w:w="260"/>
-              <w:left w:type="dxa" w:w="320"/>
-              <w:bottom w:type="dxa" w:w="260"/>
-              <w:right w:type="dxa" w:w="320"/>
+              <w:top w:type="dxa" w:w="300"/>
+              <w:left w:type="dxa" w:w="380"/>
+              <w:bottom w:type="dxa" w:w="340"/>
+              <w:right w:type="dxa" w:w="380"/>
             </w:tcMar>
           </w:tcPr>
           <w:p>
             <w:pPr>
-              <w:spacing w:after="150" w:before="0" w:line="276"/>
+              <w:spacing w:after="20" w:before="0"/>
+            </w:pPr>
+            <w:r>
+              <w:rPr>
+                <w:rFonts w:ascii="Calibri" w:cs="Calibri" w:eastAsia="Calibri" w:hAnsi="Calibri"/>
+                <w:b/>
+                <w:bCs/>
+                <w:color w:val="1E8A45"/>
+                <w:sz w:val="56"/>
+                <w:szCs w:val="56"/>
+              </w:rPr>
+              <w:t xml:space="preserve">“</w:t>
+            </w:r>
+          </w:p>
+          <w:p>
+            <w:pPr>
+              <w:spacing w:after="220" w:before="0" w:line="290"/>
             </w:pPr>
             <w:r>
               <w:rPr>
@@ -2632,7 +2648,7 @@
           </w:p>
           <w:p>
             <w:pPr>
-              <w:spacing w:after="150" w:before="0" w:line="276"/>
+              <w:spacing w:after="220" w:before="0" w:line="290"/>
             </w:pPr>
             <w:r>
               <w:rPr>
@@ -2646,7 +2662,7 @@
           </w:p>
           <w:p>
             <w:pPr>
-              <w:spacing w:after="150" w:before="0" w:line="276"/>
+              <w:spacing w:after="220" w:before="0" w:line="290"/>
             </w:pPr>
             <w:r>
               <w:rPr>
@@ -2655,26 +2671,46 @@
                 <w:sz w:val="21"/>
                 <w:szCs w:val="21"/>
               </w:rPr>
-              <w:t xml:space="preserve">Now that HIA has settled into its permanent home in Cremorne, we are once again partnering with ACS Commercial Cleaning, and what a relief it has been. Their team is flexible and happy to accommodate any unscheduled cleaning requests. Hannah and her staff are a pleasure to deal with, and the quality of cleaning is consistently exceptional.</w:t>
-            </w:r>
-          </w:p>
-          <w:p>
-            <w:pPr>
-              <w:spacing w:after="150" w:before="0" w:line="276"/>
-            </w:pPr>
-            <w:r>
-              <w:rPr>
-                <w:rFonts w:ascii="Calibri" w:cs="Calibri" w:eastAsia="Calibri" w:hAnsi="Calibri"/>
+              <w:t xml:space="preserve">Now that HIA has settled into its permanent home in Cremorne, </w:t>
+            </w:r>
+            <w:r>
+              <w:rPr>
+                <w:rFonts w:ascii="Calibri" w:cs="Calibri" w:eastAsia="Calibri" w:hAnsi="Calibri"/>
+                <w:b/>
+                <w:bCs/>
                 <w:color w:val="2B2B2B"/>
                 <w:sz w:val="21"/>
                 <w:szCs w:val="21"/>
               </w:rPr>
+              <w:t xml:space="preserve">we are once again partnering with ACS Commercial Cleaning, and what a relief it has been.</w:t>
+            </w:r>
+            <w:r>
+              <w:rPr>
+                <w:rFonts w:ascii="Calibri" w:cs="Calibri" w:eastAsia="Calibri" w:hAnsi="Calibri"/>
+                <w:color w:val="2B2B2B"/>
+                <w:sz w:val="21"/>
+                <w:szCs w:val="21"/>
+              </w:rPr>
+              <w:t xml:space="preserve"> Their team is flexible and happy to accommodate any unscheduled cleaning requests. Hannah and her staff are a pleasure to deal with, and the quality of cleaning is consistently exceptional.</w:t>
+            </w:r>
+          </w:p>
+          <w:p>
+            <w:pPr>
+              <w:spacing w:after="220" w:before="0" w:line="290"/>
+            </w:pPr>
+            <w:r>
+              <w:rPr>
+                <w:rFonts w:ascii="Calibri" w:cs="Calibri" w:eastAsia="Calibri" w:hAnsi="Calibri"/>
+                <w:color w:val="2B2B2B"/>
+                <w:sz w:val="21"/>
+                <w:szCs w:val="21"/>
+              </w:rPr>
               <w:t xml:space="preserve">ACS also collaborates with Altid Group for external window cleaning, another highly professional company. Together, they offer a comprehensive solution for all our cleaning needs. Staff have even commented on the pleasant scent of the cleaning products used, which are effective without being harsh.</w:t>
             </w:r>
           </w:p>
           <w:p>
             <w:pPr>
-              <w:spacing w:after="0" w:before="0" w:line="276"/>
+              <w:spacing w:after="0" w:before="0" w:line="290"/>
             </w:pPr>
             <w:r>
               <w:rPr>

</xml_diff>